<commit_message>
Fix the 3D version hanging on GitHub Pages
Three changes, all about the page never getting stuck on the loading screen:

- Import three.js by relative path instead of through an import map, so the
  game does not depend on import map support.
- Add a watchdog in a classic script. The old error handler lived inside the
  module, so a failure to load the module itself left the boot screen up
  forever. Now anything that stops the module from booting shows a link to
  classic.html after 9 seconds.
- Add .nojekyll so Pages serves vendor/ verbatim instead of running Jekyll
  over it.

Co-Authored-By: Claude Opus 4.8 <noreply@anthropic.com>
</commit_message>
<xml_diff>
--- a/ANSWER-KEY-Midnight-Gallery.docx
+++ b/ANSWER-KEY-Midnight-Gallery.docx
@@ -1,13 +1,13 @@
 
 <file path=word/document.xml><?xml version="1.0" encoding="utf-8"?>
-<w:document xmlns:w="http://schemas.openxmlformats.org/wordprocessingml/2006/main">
+<w:document xmlns:wpc="http://schemas.microsoft.com/office/word/2010/wordprocessingCanvas" xmlns:cx="http://schemas.microsoft.com/office/drawing/2014/chartex" xmlns:cx1="http://schemas.microsoft.com/office/drawing/2015/9/8/chartex" xmlns:cx2="http://schemas.microsoft.com/office/drawing/2015/10/21/chartex" xmlns:cx3="http://schemas.microsoft.com/office/drawing/2016/5/9/chartex" xmlns:cx4="http://schemas.microsoft.com/office/drawing/2016/5/10/chartex" xmlns:cx5="http://schemas.microsoft.com/office/drawing/2016/5/11/chartex" xmlns:cx6="http://schemas.microsoft.com/office/drawing/2016/5/12/chartex" xmlns:cx7="http://schemas.microsoft.com/office/drawing/2016/5/13/chartex" xmlns:cx8="http://schemas.microsoft.com/office/drawing/2016/5/14/chartex" xmlns:mc="http://schemas.openxmlformats.org/markup-compatibility/2006" xmlns:m="http://schemas.openxmlformats.org/officeDocument/2006/math" xmlns:aink="http://schemas.microsoft.com/office/drawing/2016/ink" xmlns:am3d="http://schemas.microsoft.com/office/drawing/2017/model3d" xmlns:oel="http://schemas.microsoft.com/office/2019/extlst" xmlns:r="http://schemas.openxmlformats.org/officeDocument/2006/relationships" xmlns:wp14="http://schemas.microsoft.com/office/word/2010/wordprocessingDrawing" xmlns:wp="http://schemas.openxmlformats.org/drawingml/2006/wordprocessingDrawing" xmlns:wpg="http://schemas.microsoft.com/office/word/2010/wordprocessingGroup" xmlns:wpi="http://schemas.microsoft.com/office/word/2010/wordprocessingInk" xmlns:wps="http://schemas.microsoft.com/office/word/2010/wordprocessingShape" xmlns:o="urn:schemas-microsoft-com:office:office" xmlns:v="urn:schemas-microsoft-com:vml" xmlns:w10="urn:schemas-microsoft-com:office:word" xmlns:w="http://schemas.openxmlformats.org/wordprocessingml/2006/main" xmlns:w14="http://schemas.microsoft.com/office/word/2010/wordml" xmlns:w15="http://schemas.microsoft.com/office/word/2012/wordml" xmlns:w16cex="http://schemas.microsoft.com/office/word/2018/wordml/cex" xmlns:w16cid="http://schemas.microsoft.com/office/word/2016/wordml/cid" xmlns:w16="http://schemas.microsoft.com/office/word/2018/wordml" xmlns:w16sdtdh="http://schemas.microsoft.com/office/word/2020/wordml/sdtdatahash" xmlns:w16sdtfl="http://schemas.microsoft.com/office/word/2024/wordml/sdtformatlock" xmlns:w16se="http://schemas.microsoft.com/office/word/2015/wordml/symex" xmlns:w16du="http://schemas.microsoft.com/office/word/2023/wordml/word16du" xmlns:wne="http://schemas.microsoft.com/office/word/2006/wordml" mc:Ignorable="w14 w15 w16se w16cid w16 w16cex w16sdtdh w16sdtfl w16du wp14">
   <w:body>
     <w:p>
       <w:pPr>
         <w:pStyle w:val="Title"/>
       </w:pPr>
       <w:r>
-        <w:t xml:space="preserve">ANSWER KEY — The Midnight Gallery</w:t>
+        <w:t>ANSWER KEY — The Midnight Gallery</w:t>
       </w:r>
     </w:p>
     <w:p>
@@ -15,28 +15,24 @@
         <w:pStyle w:val="Heading3"/>
       </w:pPr>
       <w:r>
-        <w:t xml:space="preserve">HOST MATERIAL — DO NOT OPEN THIS IN FRONT OF THE PLAYERS</w:t>
-      </w:r>
-    </w:p>
-    <w:p>
-      <w:pPr/>
-      <w:r>
-        <w:t xml:space="preserve">Unit 2 · Assessment 2.6 · Team: ______________________________</w:t>
-      </w:r>
-    </w:p>
-    <w:p>
-      <w:pPr/>
-    </w:p>
+        <w:t>HOST MATERIAL — DO NOT OPEN THIS IN FRONT OF THE PLAYERS</w:t>
+      </w:r>
+    </w:p>
+    <w:p>
+      <w:r>
+        <w:t>Unit 2 · Assessment 2.6 · Team:</w:t>
+      </w:r>
+    </w:p>
+    <w:p/>
     <w:p>
       <w:pPr>
         <w:pStyle w:val="Heading1"/>
       </w:pPr>
       <w:r>
-        <w:t xml:space="preserve">The four answers</w:t>
-      </w:r>
-    </w:p>
-    <w:p>
-      <w:pPr/>
+        <w:t>The four answers</w:t>
+      </w:r>
+    </w:p>
+    <w:p>
       <w:r>
         <w:t xml:space="preserve">Lock 1  →  </w:t>
       </w:r>
@@ -44,14 +40,13 @@
         <w:rPr>
           <w:b/>
         </w:rPr>
-        <w:t xml:space="preserve">31</w:t>
+        <w:t>31</w:t>
       </w:r>
       <w:r>
         <w:t xml:space="preserve">             Tomás Adler's staff locker</w:t>
       </w:r>
     </w:p>
     <w:p>
-      <w:pPr/>
       <w:r>
         <w:t xml:space="preserve">Lock 2  →  </w:t>
       </w:r>
@@ -59,14 +54,13 @@
         <w:rPr>
           <w:b/>
         </w:rPr>
-        <w:t xml:space="preserve">492</w:t>
+        <w:t>492</w:t>
       </w:r>
       <w:r>
         <w:t xml:space="preserve">            last three digits of the licence plate</w:t>
       </w:r>
     </w:p>
     <w:p>
-      <w:pPr/>
       <w:r>
         <w:t xml:space="preserve">Lock 3  →  </w:t>
       </w:r>
@@ -74,14 +68,13 @@
         <w:rPr>
           <w:b/>
         </w:rPr>
-        <w:t xml:space="preserve">CASTELLANOS</w:t>
+        <w:t>CASTELLANOS</w:t>
       </w:r>
       <w:r>
         <w:t xml:space="preserve">     the buyer's surname</w:t>
       </w:r>
     </w:p>
     <w:p>
-      <w:pPr/>
       <w:r>
         <w:t xml:space="preserve">Lock 4  →  </w:t>
       </w:r>
@@ -89,7 +82,7 @@
         <w:rPr>
           <w:b/>
         </w:rPr>
-        <w:t xml:space="preserve">2302</w:t>
+        <w:t>2302</w:t>
       </w:r>
       <w:r>
         <w:t xml:space="preserve">           11:02 PM on the 24-hour clock</w:t>
@@ -100,7 +93,7 @@
         <w:spacing w:before="160"/>
       </w:pPr>
       <w:r>
-        <w:t xml:space="preserve">Answers are stored in the game as hashes, so opening the page source does not reveal them. The hint text is encoded for the same reason.</w:t>
+        <w:t>Answers are stored in the game as hashes, so opening the page source does not reveal them. The hint text is encoded for the same reason.</w:t>
       </w:r>
     </w:p>
     <w:p>
@@ -108,11 +101,10 @@
         <w:pStyle w:val="Heading1"/>
       </w:pPr>
       <w:r>
-        <w:t xml:space="preserve">Lock 1 → 31   (Reading)</w:t>
-      </w:r>
-    </w:p>
-    <w:p>
-      <w:pPr/>
+        <w:t>Lock 1 → 31   (Reading)</w:t>
+      </w:r>
+    </w:p>
+    <w:p>
       <w:r>
         <w:t xml:space="preserve">Adler says he left the museum at </w:t>
       </w:r>
@@ -120,7 +112,7 @@
         <w:rPr>
           <w:b/>
         </w:rPr>
-        <w:t xml:space="preserve">9:38</w:t>
+        <w:t>9:38</w:t>
       </w:r>
       <w:r>
         <w:t xml:space="preserve"> and that he was inside the cinema </w:t>
@@ -129,7 +121,7 @@
         <w:rPr>
           <w:b/>
         </w:rPr>
-        <w:t xml:space="preserve">from 9:30</w:t>
+        <w:t>from 9:30</w:t>
       </w:r>
       <w:r>
         <w:t xml:space="preserve"> until 11:40. The film had already been running for eight minutes while he was still in the building. Nobody contradicts him — </w:t>
@@ -138,10 +130,10 @@
         <w:rPr>
           <w:b/>
         </w:rPr>
-        <w:t xml:space="preserve">he contradicts himself</w:t>
-      </w:r>
-      <w:r>
-        <w:t xml:space="preserve">.</w:t>
+        <w:t>he contradicts himself</w:t>
+      </w:r>
+      <w:r>
+        <w:t>.</w:t>
       </w:r>
     </w:p>
     <w:p>
@@ -149,7 +141,7 @@
         <w:spacing w:before="160"/>
       </w:pPr>
       <w:r>
-        <w:t xml:space="preserve">The other three statements survive checking against the access log:</w:t>
+        <w:t>The other three statements survive checking against the access log:</w:t>
       </w:r>
     </w:p>
     <w:p>
@@ -164,7 +156,7 @@
         <w:rPr>
           <w:b/>
         </w:rPr>
-        <w:t xml:space="preserve">Voss</w:t>
+        <w:t>Voss</w:t>
       </w:r>
       <w:r>
         <w:t xml:space="preserve"> — enters 21:40, leaves 21:45, her neighbour sees her arrive home just after ten. Consistent.</w:t>
@@ -182,7 +174,7 @@
         <w:rPr>
           <w:b/>
         </w:rPr>
-        <w:t xml:space="preserve">Oyelaran</w:t>
+        <w:t>Oyelaran</w:t>
       </w:r>
       <w:r>
         <w:t xml:space="preserve"> — round at 21:52, leaves 22:05, returns 22:16. Consistent.</w:t>
@@ -200,7 +192,7 @@
         <w:rPr>
           <w:b/>
         </w:rPr>
-        <w:t xml:space="preserve">Raman</w:t>
+        <w:t>Raman</w:t>
       </w:r>
       <w:r>
         <w:t xml:space="preserve"> — flew to Monterrey on Thursday; her card was used, but she was not there. Consistent with a </w:t>
@@ -209,10 +201,10 @@
         <w:rPr>
           <w:b/>
         </w:rPr>
-        <w:t xml:space="preserve">stolen card</w:t>
-      </w:r>
-      <w:r>
-        <w:t xml:space="preserve">.</w:t>
+        <w:t>stolen card</w:t>
+      </w:r>
+      <w:r>
+        <w:t>.</w:t>
       </w:r>
     </w:p>
     <w:p>
@@ -226,10 +218,10 @@
         <w:rPr>
           <w:b/>
         </w:rPr>
-        <w:t xml:space="preserve">locker 31</w:t>
-      </w:r>
-      <w:r>
-        <w:t xml:space="preserve">.</w:t>
+        <w:t>locker 31</w:t>
+      </w:r>
+      <w:r>
+        <w:t>.</w:t>
       </w:r>
     </w:p>
     <w:p>
@@ -238,13 +230,12 @@
         <w:spacing w:before="160"/>
       </w:pPr>
       <w:r>
-        <w:t xml:space="preserve">Say this: “The film started at half past nine. Tomás says he was inside that cinema the whole time, from half past nine. But he also says he walked out of this museum at twenty-two minutes to ten — and the log agrees with him. You cannot be in two places at once.”</w:t>
-      </w:r>
-    </w:p>
-    <w:p>
-      <w:pPr/>
-      <w:r>
-        <w:t xml:space="preserve">Also accepted: adler · tomas adler · Tomás Adler</w:t>
+        <w:t>Say this: “The film started at half past nine. Tomás says he was inside that cinema the whole time, from half past nine. But he also says he walked out of this museum at twenty-two minutes to ten — and the log agrees with him. You cannot be in two places at once.”</w:t>
+      </w:r>
+    </w:p>
+    <w:p>
+      <w:r>
+        <w:t>Also accepted: adler · tomas adler · Tomás Adler</w:t>
       </w:r>
     </w:p>
     <w:p>
@@ -258,10 +249,10 @@
         <w:rPr>
           <w:b/>
         </w:rPr>
-        <w:t xml:space="preserve">9:55 PM on Friday</w:t>
-      </w:r>
-      <w:r>
-        <w:t xml:space="preserve">.</w:t>
+        <w:t>9:55 PM on Friday</w:t>
+      </w:r>
+      <w:r>
+        <w:t>.</w:t>
       </w:r>
     </w:p>
     <w:p>
@@ -269,11 +260,10 @@
         <w:pStyle w:val="Heading1"/>
       </w:pPr>
       <w:r>
-        <w:t xml:space="preserve">Lock 2 → 492   (Listening)</w:t>
-      </w:r>
-    </w:p>
-    <w:p>
-      <w:pPr/>
+        <w:t>Lock 2 → 492   (Listening)</w:t>
+      </w:r>
+    </w:p>
+    <w:p>
       <w:r>
         <w:t xml:space="preserve">This number exists </w:t>
       </w:r>
@@ -281,10 +271,10 @@
         <w:rPr>
           <w:b/>
         </w:rPr>
-        <w:t xml:space="preserve">only in the audio</w:t>
-      </w:r>
-      <w:r>
-        <w:t xml:space="preserve">. It appears in no written document, and that is exactly what makes it a real listening task. Marcus says:</w:t>
+        <w:t>only in the audio</w:t>
+      </w:r>
+      <w:r>
+        <w:t>. It appears in no written document, and that is exactly what makes it a real listening task. Marcus says:</w:t>
       </w:r>
     </w:p>
     <w:p>
@@ -292,19 +282,18 @@
         <w:pStyle w:val="Quote"/>
       </w:pPr>
       <w:r>
-        <w:t xml:space="preserve">“I'm reading the licence plate off the camera monitor right now. The last three digits are four, nine, two. Four. Nine. Two.”</w:t>
-      </w:r>
-    </w:p>
-    <w:p>
-      <w:pPr/>
-      <w:r>
-        <w:t xml:space="preserve">He repeats it because that is what a person does on a voicemail — and because in a noisy classroom nobody catches it the first time. Offer a second listen before they ask for one.</w:t>
-      </w:r>
-    </w:p>
-    <w:p>
-      <w:pPr/>
-      <w:r>
-        <w:t xml:space="preserve">Also accepted: 4 9 2</w:t>
+        <w:t>“I'm reading the licence plate off the camera monitor right now. The last three digits are four, nine, two. Four. Nine. Two.”</w:t>
+      </w:r>
+    </w:p>
+    <w:p>
+      <w:r>
+        <w:t>He repeats it because that is what a person does on a voicemail — and because in a noisy classroom nobody catches it the first time. Offer a second listen before they ask for one.</w:t>
+      </w:r>
+    </w:p>
+    <w:p>
+      <w:r>
+        <w:lastRenderedPageBreak/>
+        <w:t>Also accepted: 4 9 2</w:t>
       </w:r>
     </w:p>
     <w:p>
@@ -318,7 +307,7 @@
         <w:rPr>
           <w:b/>
         </w:rPr>
-        <w:t xml:space="preserve">gift shop lost property box</w:t>
+        <w:t>gift shop lost property box</w:t>
       </w:r>
       <w:r>
         <w:t xml:space="preserve">; the corridor </w:t>
@@ -327,7 +316,7 @@
         <w:rPr>
           <w:b/>
         </w:rPr>
-        <w:t xml:space="preserve">alarm panel was switched off from the inside</w:t>
+        <w:t>alarm panel was switched off from the inside</w:t>
       </w:r>
       <w:r>
         <w:t xml:space="preserve">; and </w:t>
@@ -336,7 +325,7 @@
         <w:rPr>
           <w:b/>
         </w:rPr>
-        <w:t xml:space="preserve">nothing was actually broken</w:t>
+        <w:t>nothing was actually broken</w:t>
       </w:r>
       <w:r>
         <w:t xml:space="preserve"> in the east corridor.</w:t>
@@ -347,11 +336,10 @@
         <w:pStyle w:val="Heading1"/>
       </w:pPr>
       <w:r>
-        <w:t xml:space="preserve">Lock 3 → CASTELLANOS   (Reading)</w:t>
-      </w:r>
-    </w:p>
-    <w:p>
-      <w:pPr/>
+        <w:t>Lock 3 → CASTELLANOS   (Reading)</w:t>
+      </w:r>
+    </w:p>
+    <w:p>
       <w:r>
         <w:t xml:space="preserve">This needs </w:t>
       </w:r>
@@ -359,10 +347,10 @@
         <w:rPr>
           <w:b/>
         </w:rPr>
-        <w:t xml:space="preserve">two documents read together</w:t>
-      </w:r>
-      <w:r>
-        <w:t xml:space="preserve">, and that cross-reference is the puzzle:</w:t>
+        <w:t>two documents read together</w:t>
+      </w:r>
+      <w:r>
+        <w:t>, and that cross-reference is the puzzle:</w:t>
       </w:r>
     </w:p>
     <w:p>
@@ -380,7 +368,7 @@
         <w:rPr>
           <w:b/>
         </w:rPr>
-        <w:t xml:space="preserve">both of the Pacific Aquarium loans</w:t>
+        <w:t>both of the Pacific Aquarium loans</w:t>
       </w:r>
       <w:r>
         <w:t xml:space="preserve">” and “the vault release word stays the same as the signature: </w:t>
@@ -389,10 +377,10 @@
         <w:rPr>
           <w:b/>
         </w:rPr>
-        <w:t xml:space="preserve">his surname, nothing else</w:t>
-      </w:r>
-      <w:r>
-        <w:t xml:space="preserve">”.</w:t>
+        <w:t>his surname, nothing else</w:t>
+      </w:r>
+      <w:r>
+        <w:t>”.</w:t>
       </w:r>
     </w:p>
     <w:p>
@@ -410,7 +398,7 @@
         <w:rPr>
           <w:b/>
         </w:rPr>
-        <w:t xml:space="preserve">twice</w:t>
+        <w:t>twice</w:t>
       </w:r>
       <w:r>
         <w:t xml:space="preserve"> — L-118 “Blue Hour” and L-121 “Salt and Iron” — and both list the same authorised contact: </w:t>
@@ -419,10 +407,10 @@
         <w:rPr>
           <w:b/>
         </w:rPr>
-        <w:t xml:space="preserve">O. Castellanos</w:t>
-      </w:r>
-      <w:r>
-        <w:t xml:space="preserve">.</w:t>
+        <w:t>O. Castellanos</w:t>
+      </w:r>
+      <w:r>
+        <w:t>.</w:t>
       </w:r>
     </w:p>
     <w:p>
@@ -430,7 +418,7 @@
         <w:spacing w:before="160"/>
       </w:pPr>
       <w:r>
-        <w:t xml:space="preserve">The buyer is never named in the email. The players have to make the connection themselves.</w:t>
+        <w:t>The buyer is never named in the email. The players have to make the connection themselves.</w:t>
       </w:r>
     </w:p>
     <w:p>
@@ -438,7 +426,7 @@
         <w:spacing w:before="160"/>
       </w:pPr>
       <w:r>
-        <w:t xml:space="preserve">Deliberate distractors:</w:t>
+        <w:t>Deliberate distractors:</w:t>
       </w:r>
     </w:p>
     <w:p>
@@ -453,7 +441,7 @@
         <w:rPr>
           <w:b/>
         </w:rPr>
-        <w:t xml:space="preserve">Mbeki</w:t>
+        <w:t>Mbeki</w:t>
       </w:r>
       <w:r>
         <w:t xml:space="preserve"> — also has two loans, but to the Northern Harbour Trust, not the aquarium.</w:t>
@@ -471,7 +459,7 @@
         <w:rPr>
           <w:b/>
         </w:rPr>
-        <w:t xml:space="preserve">Ferreira</w:t>
+        <w:t>Ferreira</w:t>
       </w:r>
       <w:r>
         <w:t xml:space="preserve"> — the Cineteca contact. Tempting, because Adler's fake alibi is a film at the Cineteca called Low Tide, and the register contains a painting called “Low Tide Study”. It is a coincidence, not a clue.</w:t>
@@ -482,7 +470,7 @@
         <w:spacing w:before="160"/>
       </w:pPr>
       <w:r>
-        <w:t xml:space="preserve">Both wrong answers get a specific correction inside the game rather than a generic “incorrect”.</w:t>
+        <w:t>Both wrong answers get a specific correction inside the game rather than a generic “incorrect”.</w:t>
       </w:r>
     </w:p>
     <w:p>
@@ -490,11 +478,10 @@
         <w:pStyle w:val="Heading1"/>
       </w:pPr>
       <w:r>
-        <w:t xml:space="preserve">Lock 4 → 2302   (Logic and time)</w:t>
-      </w:r>
-    </w:p>
-    <w:p>
-      <w:pPr/>
+        <w:t>Lock 4 → 2302   (Logic and time)</w:t>
+      </w:r>
+    </w:p>
+    <w:p>
       <w:r>
         <w:t xml:space="preserve">The loading bay log has six lines, and </w:t>
       </w:r>
@@ -502,10 +489,10 @@
         <w:rPr>
           <w:b/>
         </w:rPr>
-        <w:t xml:space="preserve">only one of them mentions the crate</w:t>
-      </w:r>
-      <w:r>
-        <w:t xml:space="preserve">: 11:02 PM, EXIT, card #004, crate HB-7741, door held four minutes.</w:t>
+        <w:t>only one of them mentions the crate</w:t>
+      </w:r>
+      <w:r>
+        <w:t>: 11:02 PM, EXIT, card #004, crate HB-7741, door held four minutes.</w:t>
       </w:r>
     </w:p>
     <w:p>
@@ -519,7 +506,7 @@
         <w:rPr>
           <w:b/>
         </w:rPr>
-        <w:t xml:space="preserve">12-hour</w:t>
+        <w:t>12-hour</w:t>
       </w:r>
       <w:r>
         <w:t xml:space="preserve"> clock while every other document in the case is written on a </w:t>
@@ -528,7 +515,7 @@
         <w:rPr>
           <w:b/>
         </w:rPr>
-        <w:t xml:space="preserve">24-hour</w:t>
+        <w:t>24-hour</w:t>
       </w:r>
       <w:r>
         <w:t xml:space="preserve"> clock. The keypad asks for 24-hour format, so 11:02 PM = 23:02 → </w:t>
@@ -537,10 +524,10 @@
         <w:rPr>
           <w:b/>
         </w:rPr>
-        <w:t xml:space="preserve">2302</w:t>
-      </w:r>
-      <w:r>
-        <w:t xml:space="preserve">.</w:t>
+        <w:t>2302</w:t>
+      </w:r>
+      <w:r>
+        <w:t>.</w:t>
       </w:r>
     </w:p>
     <w:p>
@@ -551,7 +538,7 @@
         <w:rPr>
           <w:b/>
         </w:rPr>
-        <w:t xml:space="preserve">1102 and 11:02 PM are rejected on purpose</w:t>
+        <w:t>1102 and 11:02 PM are rejected on purpose</w:t>
       </w:r>
       <w:r>
         <w:t xml:space="preserve"> — the conversion is the puzzle. Both get a message that says so.</w:t>
@@ -562,7 +549,7 @@
         <w:spacing w:before="160"/>
       </w:pPr>
       <w:r>
-        <w:t xml:space="preserve">The two “no card” lines (10:40 PM and 11:06 PM) are there to tempt a guess: they are the buyer arriving and leaving.</w:t>
+        <w:t>The two “no card” lines (10:40 PM and 11:06 PM) are there to tempt a guess: they are the buyer arriving and leaving.</w:t>
       </w:r>
     </w:p>
     <w:p>
@@ -570,16 +557,15 @@
         <w:pStyle w:val="Heading1"/>
       </w:pPr>
       <w:r>
-        <w:t xml:space="preserve">The full solution</w:t>
-      </w:r>
-    </w:p>
-    <w:p>
-      <w:pPr/>
-      <w:r>
-        <w:rPr>
-          <w:b/>
-        </w:rPr>
-        <w:t xml:space="preserve">Tomás Adler</w:t>
+        <w:t>The full solution</w:t>
+      </w:r>
+    </w:p>
+    <w:p>
+      <w:r>
+        <w:rPr>
+          <w:b/>
+        </w:rPr>
+        <w:t>Tomás Adler</w:t>
       </w:r>
       <w:r>
         <w:t xml:space="preserve">, the gift shop manager, stole The Sleeping Lighthouse and sold it to </w:t>
@@ -588,10 +574,10 @@
         <w:rPr>
           <w:b/>
         </w:rPr>
-        <w:t xml:space="preserve">O. Castellanos</w:t>
-      </w:r>
-      <w:r>
-        <w:t xml:space="preserve">, a buyer who had already been inside the museum twice as the authorised contact for two Pacific Aquarium loans.</w:t>
+        <w:t>O. Castellanos</w:t>
+      </w:r>
+      <w:r>
+        <w:t>, a buyer who had already been inside the museum twice as the authorised contact for two Pacific Aquarium loans.</w:t>
       </w:r>
     </w:p>
     <w:p>
@@ -602,7 +588,7 @@
         <w:rPr>
           <w:b/>
         </w:rPr>
-        <w:t xml:space="preserve">The detail that closes the case:</w:t>
+        <w:t>The detail that closes the case:</w:t>
       </w:r>
       <w:r>
         <w:t xml:space="preserve"> Adler's card opens </w:t>
@@ -611,7 +597,7 @@
         <w:rPr>
           <w:b/>
         </w:rPr>
-        <w:t xml:space="preserve">only the gift shop and the loading bay</w:t>
+        <w:t>only the gift shop and the loading bay</w:t>
       </w:r>
       <w:r>
         <w:t xml:space="preserve"> — it cannot open Gallery 4. He used </w:t>
@@ -620,7 +606,7 @@
         <w:rPr>
           <w:b/>
         </w:rPr>
-        <w:t xml:space="preserve">Priya Raman's card</w:t>
+        <w:t>Priya Raman's card</w:t>
       </w:r>
       <w:r>
         <w:t xml:space="preserve">, which Marcus had handed in to the </w:t>
@@ -629,7 +615,7 @@
         <w:rPr>
           <w:b/>
         </w:rPr>
-        <w:t xml:space="preserve">gift shop lost property box</w:t>
+        <w:t>gift shop lost property box</w:t>
       </w:r>
       <w:r>
         <w:t xml:space="preserve"> on Thursday. The shop Adler manages. Priya was at a wedding in Monterrey.</w:t>
@@ -643,7 +629,7 @@
         <w:rPr>
           <w:b/>
         </w:rPr>
-        <w:t xml:space="preserve">That fact is only in the voicemail.</w:t>
+        <w:t>That fact is only in the voicemail.</w:t>
       </w:r>
       <w:r>
         <w:t xml:space="preserve"> If a team opens the vault but cannot explain it, they have not closed the case.</w:t>
@@ -654,7 +640,8 @@
         <w:spacing w:before="160"/>
       </w:pPr>
       <w:r>
-        <w:t xml:space="preserve">The timeline closes tight: the camera shows the painting ON WALL at 22:00 and GONE at 22:15, and the only card inside Gallery 4 in that window is Priya's, 22:08–22:14.</w:t>
+        <w:lastRenderedPageBreak/>
+        <w:t>The timeline closes tight: the camera shows the painting ON WALL at 22:00 and GONE at 22:15, and the only card inside Gallery 4 in that window is Priya's, 22:08–22:14.</w:t>
       </w:r>
     </w:p>
     <w:p>
@@ -662,148 +649,136 @@
         <w:pStyle w:val="Heading1"/>
       </w:pPr>
       <w:r>
-        <w:t xml:space="preserve">Timeline of Friday night</w:t>
-      </w:r>
-    </w:p>
-    <w:p>
-      <w:pPr/>
-      <w:r>
-        <w:rPr>
-          <w:b/>
-        </w:rPr>
-        <w:t xml:space="preserve">9:38 PM</w:t>
+        <w:t>Timeline of Friday night</w:t>
+      </w:r>
+    </w:p>
+    <w:p>
+      <w:r>
+        <w:rPr>
+          <w:b/>
+        </w:rPr>
+        <w:t>9:38 PM</w:t>
       </w:r>
       <w:r>
         <w:t xml:space="preserve"> — Adler badges out of the west staff door — his alibi begins   (Doc A)</w:t>
       </w:r>
     </w:p>
     <w:p>
-      <w:pPr/>
-      <w:r>
-        <w:rPr>
-          <w:b/>
-        </w:rPr>
-        <w:t xml:space="preserve">9:45 PM</w:t>
+      <w:r>
+        <w:rPr>
+          <w:b/>
+        </w:rPr>
+        <w:t>9:45 PM</w:t>
       </w:r>
       <w:r>
         <w:t xml:space="preserve"> — Voss locks up; the painting is on the wall   (Doc A)</w:t>
       </w:r>
     </w:p>
     <w:p>
-      <w:pPr/>
-      <w:r>
-        <w:rPr>
-          <w:b/>
-        </w:rPr>
-        <w:t xml:space="preserve">9:52 PM</w:t>
+      <w:r>
+        <w:rPr>
+          <w:b/>
+        </w:rPr>
+        <w:t>9:52 PM</w:t>
       </w:r>
       <w:r>
         <w:t xml:space="preserve"> — Marcus walks his round; the painting is still there   (Doc B + audio)</w:t>
       </w:r>
     </w:p>
     <w:p>
-      <w:pPr/>
-      <w:r>
-        <w:rPr>
-          <w:b/>
-        </w:rPr>
-        <w:t xml:space="preserve">9:55 PM</w:t>
+      <w:r>
+        <w:rPr>
+          <w:b/>
+        </w:rPr>
+        <w:t>9:55 PM</w:t>
       </w:r>
       <w:r>
         <w:t xml:space="preserve"> — Adler's card enters the loading bay. He never went to any cinema   (Doc H)</w:t>
       </w:r>
     </w:p>
     <w:p>
-      <w:pPr/>
-      <w:r>
-        <w:rPr>
-          <w:b/>
-        </w:rPr>
-        <w:t xml:space="preserve">10:00 PM</w:t>
+      <w:r>
+        <w:rPr>
+          <w:b/>
+        </w:rPr>
+        <w:t>10:00 PM</w:t>
       </w:r>
       <w:r>
         <w:t xml:space="preserve"> — Camera still: ON WALL   (Doc A)</w:t>
       </w:r>
     </w:p>
     <w:p>
-      <w:pPr/>
-      <w:r>
-        <w:rPr>
-          <w:b/>
-        </w:rPr>
-        <w:t xml:space="preserve">10:05 PM</w:t>
+      <w:r>
+        <w:rPr>
+          <w:b/>
+        </w:rPr>
+        <w:t>10:05 PM</w:t>
       </w:r>
       <w:r>
         <w:t xml:space="preserve"> — Glass breaks in the east corridor — and nothing is broken. A distraction   (audio)</w:t>
       </w:r>
     </w:p>
     <w:p>
-      <w:pPr/>
-      <w:r>
-        <w:rPr>
-          <w:b/>
-        </w:rPr>
-        <w:t xml:space="preserve">10:08–10:14</w:t>
+      <w:r>
+        <w:rPr>
+          <w:b/>
+        </w:rPr>
+        <w:t>10:08–10:14</w:t>
       </w:r>
       <w:r>
         <w:t xml:space="preserve"> — Priya's card opens and closes Gallery 4   (Doc A)</w:t>
       </w:r>
     </w:p>
     <w:p>
-      <w:pPr/>
-      <w:r>
-        <w:rPr>
-          <w:b/>
-        </w:rPr>
-        <w:t xml:space="preserve">10:15 PM</w:t>
+      <w:r>
+        <w:rPr>
+          <w:b/>
+        </w:rPr>
+        <w:t>10:15 PM</w:t>
       </w:r>
       <w:r>
         <w:t xml:space="preserve"> — Camera still: GONE. Six minutes was all it took   (Doc A)</w:t>
       </w:r>
     </w:p>
     <w:p>
-      <w:pPr/>
-      <w:r>
-        <w:rPr>
-          <w:b/>
-        </w:rPr>
-        <w:t xml:space="preserve">10:16 PM</w:t>
+      <w:r>
+        <w:rPr>
+          <w:b/>
+        </w:rPr>
+        <w:t>10:16 PM</w:t>
       </w:r>
       <w:r>
         <w:t xml:space="preserve"> — Marcus comes back and finds an empty bracket   (Doc A)</w:t>
       </w:r>
     </w:p>
     <w:p>
-      <w:pPr/>
-      <w:r>
-        <w:rPr>
-          <w:b/>
-        </w:rPr>
-        <w:t xml:space="preserve">10:18 PM</w:t>
+      <w:r>
+        <w:rPr>
+          <w:b/>
+        </w:rPr>
+        <w:t>10:18 PM</w:t>
       </w:r>
       <w:r>
         <w:t xml:space="preserve"> — He leaves the message nobody ever played   (audio)</w:t>
       </w:r>
     </w:p>
     <w:p>
-      <w:pPr/>
-      <w:r>
-        <w:rPr>
-          <w:b/>
-        </w:rPr>
-        <w:t xml:space="preserve">10:30 PM</w:t>
+      <w:r>
+        <w:rPr>
+          <w:b/>
+        </w:rPr>
+        <w:t>10:30 PM</w:t>
       </w:r>
       <w:r>
         <w:t xml:space="preserve"> — The camera goes into maintenance mode. Only staff can do that   (Doc A)</w:t>
       </w:r>
     </w:p>
     <w:p>
-      <w:pPr/>
-      <w:r>
-        <w:rPr>
-          <w:b/>
-        </w:rPr>
-        <w:t xml:space="preserve">11:02 PM</w:t>
+      <w:r>
+        <w:rPr>
+          <w:b/>
+        </w:rPr>
+        <w:t>11:02 PM</w:t>
       </w:r>
       <w:r>
         <w:t xml:space="preserve"> — Crate HB-7741 leaves, signed for by O. Castellanos   (Docs E/F/G/H)</w:t>
@@ -814,13 +789,12 @@
         <w:pStyle w:val="Heading1"/>
       </w:pPr>
       <w:r>
-        <w:t xml:space="preserve">The six closing questions (one per player)</w:t>
-      </w:r>
-    </w:p>
-    <w:p>
-      <w:pPr/>
-      <w:r>
-        <w:t xml:space="preserve">Ask one each, so every player is assessed on speaking. Full sentences, and they must name the document or recording that proves it.</w:t>
+        <w:t>The six closing questions (one per player)</w:t>
+      </w:r>
+    </w:p>
+    <w:p>
+      <w:r>
+        <w:t>Ask one each, so every player is assessed on speaking. Full sentences, and they must name the document or recording that proves it.</w:t>
       </w:r>
     </w:p>
     <w:p>
@@ -828,7 +802,7 @@
         <w:spacing w:before="140"/>
       </w:pPr>
       <w:r>
-        <w:t xml:space="preserve">1.  Who took the painting, and what exactly was wrong with their statement?</w:t>
+        <w:t>1.  Who took the painting, and what exactly was wrong with their statement?</w:t>
       </w:r>
     </w:p>
     <w:p>
@@ -836,7 +810,7 @@
         <w:pStyle w:val="Quote"/>
       </w:pPr>
       <w:r>
-        <w:t xml:space="preserve">→ Tomás Adler. He said he left at 9:38 and that he was in the cinema from 9:30 — both cannot be true.</w:t>
+        <w:t>→ Tomás Adler. He said he left at 9:38 and that he was in the cinema from 9:30 — both cannot be true.</w:t>
       </w:r>
     </w:p>
     <w:p>
@@ -844,7 +818,7 @@
         <w:spacing w:before="140"/>
       </w:pPr>
       <w:r>
-        <w:t xml:space="preserve">2.  His card only opens the gift shop and the loading bay. So how did he get into Gallery 4?</w:t>
+        <w:t>2.  His card only opens the gift shop and the loading bay. So how did he get into Gallery 4?</w:t>
       </w:r>
     </w:p>
     <w:p>
@@ -852,7 +826,7 @@
         <w:pStyle w:val="Quote"/>
       </w:pPr>
       <w:r>
-        <w:t xml:space="preserve">→ With Priya Raman's card, which was in the gift shop lost property box — this comes only from the voicemail.</w:t>
+        <w:t>→ With Priya Raman's card, which was in the gift shop lost property box — this comes only from the voicemail.</w:t>
       </w:r>
     </w:p>
     <w:p>
@@ -860,7 +834,7 @@
         <w:spacing w:before="140"/>
       </w:pPr>
       <w:r>
-        <w:t xml:space="preserve">3.  Priya's card opened Gallery 4 at 22:08. Why is she not the thief?</w:t>
+        <w:t>3.  Priya's card opened Gallery 4 at 22:08. Why is she not the thief?</w:t>
       </w:r>
     </w:p>
     <w:p>
@@ -868,7 +842,7 @@
         <w:pStyle w:val="Quote"/>
       </w:pPr>
       <w:r>
-        <w:t xml:space="preserve">→ She was at her sister's wedding in Monterrey; she flew out on Thursday and has a boarding pass.</w:t>
+        <w:t>→ She was at her sister's wedding in Monterrey; she flew out on Thursday and has a boarding pass.</w:t>
       </w:r>
     </w:p>
     <w:p>
@@ -876,7 +850,7 @@
         <w:spacing w:before="140"/>
       </w:pPr>
       <w:r>
-        <w:t xml:space="preserve">4.  Who was the buyer, and how did you work out his name?</w:t>
+        <w:t>4.  Who was the buyer, and how did you work out his name?</w:t>
       </w:r>
     </w:p>
     <w:p>
@@ -884,7 +858,7 @@
         <w:pStyle w:val="Quote"/>
       </w:pPr>
       <w:r>
-        <w:t xml:space="preserve">→ O. Castellanos — the authorised contact on both Pacific Aquarium loans, L-118 and L-121, cross-referenced with the email.</w:t>
+        <w:t>→ O. Castellanos — the authorised contact on both Pacific Aquarium loans, L-118 and L-121, cross-referenced with the email.</w:t>
       </w:r>
     </w:p>
     <w:p>
@@ -892,7 +866,7 @@
         <w:spacing w:before="140"/>
       </w:pPr>
       <w:r>
-        <w:t xml:space="preserve">5.  The camera went into maintenance mode at 22:30. Who could do that, and why does it matter?</w:t>
+        <w:t>5.  The camera went into maintenance mode at 22:30. Who could do that, and why does it matter?</w:t>
       </w:r>
     </w:p>
     <w:p>
@@ -900,7 +874,7 @@
         <w:pStyle w:val="Quote"/>
       </w:pPr>
       <w:r>
-        <w:t xml:space="preserve">→ Only staff. It is more proof the thief was inside, and it hid the crate being moved at 23:02.</w:t>
+        <w:t>→ Only staff. It is more proof the thief was inside, and it hid the crate being moved at 23:02.</w:t>
       </w:r>
     </w:p>
     <w:p>
@@ -908,7 +882,7 @@
         <w:spacing w:before="140"/>
       </w:pPr>
       <w:r>
-        <w:t xml:space="preserve">6.  Give one thing you could only learn from the voicemail.</w:t>
+        <w:t>6.  Give one thing you could only learn from the voicemail.</w:t>
       </w:r>
     </w:p>
     <w:p>
@@ -916,7 +890,7 @@
         <w:pStyle w:val="Quote"/>
       </w:pPr>
       <w:r>
-        <w:t xml:space="preserve">→ The plate 492 · the lost property box · the alarm panel switched off from the inside · nothing was actually broken.</w:t>
+        <w:t>→ The plate 492 · the lost property box · the alarm panel switched off from the inside · nothing was actually broken.</w:t>
       </w:r>
     </w:p>
     <w:p>
@@ -927,7 +901,8 @@
         <w:rPr>
           <w:b/>
         </w:rPr>
-        <w:t xml:space="preserve">Accept any answer that is supported by a document, even if it is not the one above.</w:t>
+        <w:lastRenderedPageBreak/>
+        <w:t>Accept any answer that is supported by a document, even if it is not the one above.</w:t>
       </w:r>
       <w:r>
         <w:t xml:space="preserve"> If a player argues a different reading and can point to the evidence, give them the credit — that is exactly what the rubric rewards.</w:t>
@@ -937,60 +912,482 @@
       <w:pPr>
         <w:spacing w:before="240"/>
       </w:pPr>
-      <w:r>
-        <w:t xml:space="preserve">Full materials in ~/Documents/escape-room-unit2/ · Host guide: HOST-GUIDE.md</w:t>
-      </w:r>
     </w:p>
     <w:sectPr>
       <w:pgSz w:w="11906" w:h="16838"/>
-      <w:pgMar w:top="1134" w:right="1134" w:bottom="1134" w:left="1134"/>
+      <w:pgMar w:top="1134" w:right="1134" w:bottom="1134" w:left="1134" w:header="720" w:footer="720" w:gutter="0"/>
+      <w:cols w:space="720"/>
     </w:sectPr>
   </w:body>
 </w:document>
 </file>
 
 <file path=word/numbering.xml><?xml version="1.0" encoding="utf-8"?>
-<w:numbering xmlns:w="http://schemas.openxmlformats.org/wordprocessingml/2006/main">
-  <w:abstractNum w:abstractNumId="0">
+<w:numbering xmlns:wpc="http://schemas.microsoft.com/office/word/2010/wordprocessingCanvas" xmlns:cx="http://schemas.microsoft.com/office/drawing/2014/chartex" xmlns:cx1="http://schemas.microsoft.com/office/drawing/2015/9/8/chartex" xmlns:cx2="http://schemas.microsoft.com/office/drawing/2015/10/21/chartex" xmlns:cx3="http://schemas.microsoft.com/office/drawing/2016/5/9/chartex" xmlns:cx4="http://schemas.microsoft.com/office/drawing/2016/5/10/chartex" xmlns:cx5="http://schemas.microsoft.com/office/drawing/2016/5/11/chartex" xmlns:cx6="http://schemas.microsoft.com/office/drawing/2016/5/12/chartex" xmlns:cx7="http://schemas.microsoft.com/office/drawing/2016/5/13/chartex" xmlns:cx8="http://schemas.microsoft.com/office/drawing/2016/5/14/chartex" xmlns:mc="http://schemas.openxmlformats.org/markup-compatibility/2006" xmlns:m="http://schemas.openxmlformats.org/officeDocument/2006/math" xmlns:aink="http://schemas.microsoft.com/office/drawing/2016/ink" xmlns:am3d="http://schemas.microsoft.com/office/drawing/2017/model3d" xmlns:oel="http://schemas.microsoft.com/office/2019/extlst" xmlns:r="http://schemas.openxmlformats.org/officeDocument/2006/relationships" xmlns:wp14="http://schemas.microsoft.com/office/word/2010/wordprocessingDrawing" xmlns:wp="http://schemas.openxmlformats.org/drawingml/2006/wordprocessingDrawing" xmlns:wpg="http://schemas.microsoft.com/office/word/2010/wordprocessingGroup" xmlns:wpi="http://schemas.microsoft.com/office/word/2010/wordprocessingInk" xmlns:wps="http://schemas.microsoft.com/office/word/2010/wordprocessingShape" xmlns:o="urn:schemas-microsoft-com:office:office" xmlns:v="urn:schemas-microsoft-com:vml" xmlns:w10="urn:schemas-microsoft-com:office:word" xmlns:w="http://schemas.openxmlformats.org/wordprocessingml/2006/main" xmlns:w14="http://schemas.microsoft.com/office/word/2010/wordml" xmlns:w15="http://schemas.microsoft.com/office/word/2012/wordml" xmlns:w16cex="http://schemas.microsoft.com/office/word/2018/wordml/cex" xmlns:w16cid="http://schemas.microsoft.com/office/word/2016/wordml/cid" xmlns:w16="http://schemas.microsoft.com/office/word/2018/wordml" xmlns:w16sdtdh="http://schemas.microsoft.com/office/word/2020/wordml/sdtdatahash" xmlns:w16sdtfl="http://schemas.microsoft.com/office/word/2024/wordml/sdtformatlock" xmlns:w16se="http://schemas.microsoft.com/office/word/2015/wordml/symex" xmlns:w16du="http://schemas.microsoft.com/office/word/2023/wordml/word16du" xmlns:wne="http://schemas.microsoft.com/office/word/2006/wordml" mc:Ignorable="w14 w15 w16se w16cid w16 w16cex w16sdtdh w16sdtfl w16du wp14">
+  <w:abstractNum w:abstractNumId="0" w15:restartNumberingAfterBreak="0">
+    <w:nsid w:val="3FA9005F"/>
+    <w:multiLevelType w:val="multilevel"/>
+    <w:tmpl w:val="C4C8AF00"/>
     <w:lvl w:ilvl="0">
       <w:numFmt w:val="bullet"/>
       <w:lvlText w:val="•"/>
+      <w:lvlJc w:val="left"/>
       <w:pPr>
         <w:ind w:left="720" w:hanging="360"/>
       </w:pPr>
+    </w:lvl>
+    <w:lvl w:ilvl="1">
+      <w:numFmt w:val="decimal"/>
+      <w:lvlText w:val=""/>
+      <w:lvlJc w:val="left"/>
+    </w:lvl>
+    <w:lvl w:ilvl="2">
+      <w:numFmt w:val="decimal"/>
+      <w:lvlText w:val=""/>
+      <w:lvlJc w:val="left"/>
+    </w:lvl>
+    <w:lvl w:ilvl="3">
+      <w:numFmt w:val="decimal"/>
+      <w:lvlText w:val=""/>
+      <w:lvlJc w:val="left"/>
+    </w:lvl>
+    <w:lvl w:ilvl="4">
+      <w:numFmt w:val="decimal"/>
+      <w:lvlText w:val=""/>
+      <w:lvlJc w:val="left"/>
+    </w:lvl>
+    <w:lvl w:ilvl="5">
+      <w:numFmt w:val="decimal"/>
+      <w:lvlText w:val=""/>
+      <w:lvlJc w:val="left"/>
+    </w:lvl>
+    <w:lvl w:ilvl="6">
+      <w:numFmt w:val="decimal"/>
+      <w:lvlText w:val=""/>
+      <w:lvlJc w:val="left"/>
+    </w:lvl>
+    <w:lvl w:ilvl="7">
+      <w:numFmt w:val="decimal"/>
+      <w:lvlText w:val=""/>
+      <w:lvlJc w:val="left"/>
+    </w:lvl>
+    <w:lvl w:ilvl="8">
+      <w:numFmt w:val="decimal"/>
+      <w:lvlText w:val=""/>
+      <w:lvlJc w:val="left"/>
     </w:lvl>
   </w:abstractNum>
-  <w:num w:numId="1">
+  <w:num w:numId="1" w16cid:durableId="196554463">
     <w:abstractNumId w:val="0"/>
   </w:num>
 </w:numbering>
 </file>
 
 <file path=word/styles.xml><?xml version="1.0" encoding="utf-8"?>
-<w:styles xmlns:w="http://schemas.openxmlformats.org/wordprocessingml/2006/main">
+<w:styles xmlns:mc="http://schemas.openxmlformats.org/markup-compatibility/2006" xmlns:r="http://schemas.openxmlformats.org/officeDocument/2006/relationships" xmlns:w="http://schemas.openxmlformats.org/wordprocessingml/2006/main" xmlns:w14="http://schemas.microsoft.com/office/word/2010/wordml" xmlns:w15="http://schemas.microsoft.com/office/word/2012/wordml" xmlns:w16cex="http://schemas.microsoft.com/office/word/2018/wordml/cex" xmlns:w16cid="http://schemas.microsoft.com/office/word/2016/wordml/cid" xmlns:w16="http://schemas.microsoft.com/office/word/2018/wordml" xmlns:w16sdtdh="http://schemas.microsoft.com/office/word/2020/wordml/sdtdatahash" xmlns:w16sdtfl="http://schemas.microsoft.com/office/word/2024/wordml/sdtformatlock" xmlns:w16se="http://schemas.microsoft.com/office/word/2015/wordml/symex" xmlns:w16du="http://schemas.microsoft.com/office/word/2023/wordml/word16du" mc:Ignorable="w14 w15 w16se w16cid w16 w16cex w16sdtdh w16sdtfl w16du">
   <w:docDefaults>
     <w:rPrDefault>
       <w:rPr>
-        <w:rFonts w:ascii="Georgia" w:hAnsi="Georgia"/>
+        <w:rFonts w:ascii="Georgia" w:eastAsia="Times New Roman" w:hAnsi="Georgia" w:cs="Times New Roman"/>
         <w:sz w:val="22"/>
+        <w:lang w:val="en-MX" w:eastAsia="en-US" w:bidi="ar-SA"/>
       </w:rPr>
     </w:rPrDefault>
+    <w:pPrDefault>
+      <w:pPr>
+        <w:spacing w:after="160" w:line="278" w:lineRule="auto"/>
+      </w:pPr>
+    </w:pPrDefault>
   </w:docDefaults>
-  <w:style w:type="paragraph" w:styleId="Title">
-    <w:name w:val="Title"/>
-    <w:pPr>
-      <w:spacing w:before="0" w:after="120"/>
-    </w:pPr>
-    <w:rPr>
-      <w:b/>
-      <w:color w:val="8A6A1F"/>
-      <w:sz w:val="44"/>
-    </w:rPr>
+  <w:latentStyles w:defLockedState="0" w:defUIPriority="99" w:defSemiHidden="0" w:defUnhideWhenUsed="0" w:defQFormat="0" w:count="376">
+    <w:lsdException w:name="Normal" w:uiPriority="0" w:qFormat="1"/>
+    <w:lsdException w:name="heading 1" w:uiPriority="9" w:qFormat="1"/>
+    <w:lsdException w:name="heading 2" w:semiHidden="1" w:uiPriority="9" w:unhideWhenUsed="1" w:qFormat="1"/>
+    <w:lsdException w:name="heading 3" w:semiHidden="1" w:uiPriority="9" w:unhideWhenUsed="1" w:qFormat="1"/>
+    <w:lsdException w:name="heading 4" w:semiHidden="1" w:uiPriority="9" w:unhideWhenUsed="1" w:qFormat="1"/>
+    <w:lsdException w:name="heading 5" w:semiHidden="1" w:uiPriority="9" w:unhideWhenUsed="1" w:qFormat="1"/>
+    <w:lsdException w:name="heading 6" w:semiHidden="1" w:uiPriority="9" w:unhideWhenUsed="1" w:qFormat="1"/>
+    <w:lsdException w:name="heading 7" w:semiHidden="1" w:uiPriority="9" w:unhideWhenUsed="1" w:qFormat="1"/>
+    <w:lsdException w:name="heading 8" w:semiHidden="1" w:uiPriority="9" w:unhideWhenUsed="1" w:qFormat="1"/>
+    <w:lsdException w:name="heading 9" w:semiHidden="1" w:uiPriority="9" w:unhideWhenUsed="1" w:qFormat="1"/>
+    <w:lsdException w:name="index 1" w:semiHidden="1" w:unhideWhenUsed="1"/>
+    <w:lsdException w:name="index 2" w:semiHidden="1" w:unhideWhenUsed="1"/>
+    <w:lsdException w:name="index 3" w:semiHidden="1" w:unhideWhenUsed="1"/>
+    <w:lsdException w:name="index 4" w:semiHidden="1" w:unhideWhenUsed="1"/>
+    <w:lsdException w:name="index 5" w:semiHidden="1" w:unhideWhenUsed="1"/>
+    <w:lsdException w:name="index 6" w:semiHidden="1" w:unhideWhenUsed="1"/>
+    <w:lsdException w:name="index 7" w:semiHidden="1" w:unhideWhenUsed="1"/>
+    <w:lsdException w:name="index 8" w:semiHidden="1" w:unhideWhenUsed="1"/>
+    <w:lsdException w:name="index 9" w:semiHidden="1" w:unhideWhenUsed="1"/>
+    <w:lsdException w:name="toc 1" w:semiHidden="1" w:uiPriority="39" w:unhideWhenUsed="1"/>
+    <w:lsdException w:name="toc 2" w:semiHidden="1" w:uiPriority="39" w:unhideWhenUsed="1"/>
+    <w:lsdException w:name="toc 3" w:semiHidden="1" w:uiPriority="39" w:unhideWhenUsed="1"/>
+    <w:lsdException w:name="toc 4" w:semiHidden="1" w:uiPriority="39" w:unhideWhenUsed="1"/>
+    <w:lsdException w:name="toc 5" w:semiHidden="1" w:uiPriority="39" w:unhideWhenUsed="1"/>
+    <w:lsdException w:name="toc 6" w:semiHidden="1" w:uiPriority="39" w:unhideWhenUsed="1"/>
+    <w:lsdException w:name="toc 7" w:semiHidden="1" w:uiPriority="39" w:unhideWhenUsed="1"/>
+    <w:lsdException w:name="toc 8" w:semiHidden="1" w:uiPriority="39" w:unhideWhenUsed="1"/>
+    <w:lsdException w:name="toc 9" w:semiHidden="1" w:uiPriority="39" w:unhideWhenUsed="1"/>
+    <w:lsdException w:name="Normal Indent" w:semiHidden="1" w:unhideWhenUsed="1"/>
+    <w:lsdException w:name="footnote text" w:semiHidden="1" w:unhideWhenUsed="1"/>
+    <w:lsdException w:name="annotation text" w:semiHidden="1" w:unhideWhenUsed="1"/>
+    <w:lsdException w:name="header" w:semiHidden="1" w:unhideWhenUsed="1"/>
+    <w:lsdException w:name="footer" w:semiHidden="1" w:unhideWhenUsed="1"/>
+    <w:lsdException w:name="index heading" w:semiHidden="1" w:unhideWhenUsed="1"/>
+    <w:lsdException w:name="caption" w:semiHidden="1" w:uiPriority="35" w:unhideWhenUsed="1" w:qFormat="1"/>
+    <w:lsdException w:name="table of figures" w:semiHidden="1" w:unhideWhenUsed="1"/>
+    <w:lsdException w:name="envelope address" w:semiHidden="1" w:unhideWhenUsed="1"/>
+    <w:lsdException w:name="envelope return" w:semiHidden="1" w:unhideWhenUsed="1"/>
+    <w:lsdException w:name="footnote reference" w:semiHidden="1" w:unhideWhenUsed="1"/>
+    <w:lsdException w:name="annotation reference" w:semiHidden="1" w:unhideWhenUsed="1"/>
+    <w:lsdException w:name="line number" w:semiHidden="1" w:unhideWhenUsed="1"/>
+    <w:lsdException w:name="page number" w:semiHidden="1" w:unhideWhenUsed="1"/>
+    <w:lsdException w:name="endnote reference" w:semiHidden="1" w:unhideWhenUsed="1"/>
+    <w:lsdException w:name="endnote text" w:semiHidden="1" w:unhideWhenUsed="1"/>
+    <w:lsdException w:name="table of authorities" w:semiHidden="1" w:unhideWhenUsed="1"/>
+    <w:lsdException w:name="macro" w:semiHidden="1" w:unhideWhenUsed="1"/>
+    <w:lsdException w:name="toa heading" w:semiHidden="1" w:unhideWhenUsed="1"/>
+    <w:lsdException w:name="List" w:semiHidden="1" w:unhideWhenUsed="1"/>
+    <w:lsdException w:name="List Bullet" w:semiHidden="1" w:unhideWhenUsed="1"/>
+    <w:lsdException w:name="List Number" w:semiHidden="1" w:unhideWhenUsed="1"/>
+    <w:lsdException w:name="List 2" w:semiHidden="1" w:unhideWhenUsed="1"/>
+    <w:lsdException w:name="List 3" w:semiHidden="1" w:unhideWhenUsed="1"/>
+    <w:lsdException w:name="List 4" w:semiHidden="1" w:unhideWhenUsed="1"/>
+    <w:lsdException w:name="List 5" w:semiHidden="1" w:unhideWhenUsed="1"/>
+    <w:lsdException w:name="List Bullet 2" w:semiHidden="1" w:unhideWhenUsed="1"/>
+    <w:lsdException w:name="List Bullet 3" w:semiHidden="1" w:unhideWhenUsed="1"/>
+    <w:lsdException w:name="List Bullet 4" w:semiHidden="1" w:unhideWhenUsed="1"/>
+    <w:lsdException w:name="List Bullet 5" w:semiHidden="1" w:unhideWhenUsed="1"/>
+    <w:lsdException w:name="List Number 2" w:semiHidden="1" w:unhideWhenUsed="1"/>
+    <w:lsdException w:name="List Number 3" w:semiHidden="1" w:unhideWhenUsed="1"/>
+    <w:lsdException w:name="List Number 4" w:semiHidden="1" w:unhideWhenUsed="1"/>
+    <w:lsdException w:name="List Number 5" w:semiHidden="1" w:unhideWhenUsed="1"/>
+    <w:lsdException w:name="Title" w:uiPriority="10" w:qFormat="1"/>
+    <w:lsdException w:name="Closing" w:semiHidden="1" w:unhideWhenUsed="1"/>
+    <w:lsdException w:name="Signature" w:semiHidden="1" w:unhideWhenUsed="1"/>
+    <w:lsdException w:name="Default Paragraph Font" w:semiHidden="1" w:uiPriority="1" w:unhideWhenUsed="1"/>
+    <w:lsdException w:name="Body Text" w:semiHidden="1" w:unhideWhenUsed="1"/>
+    <w:lsdException w:name="Body Text Indent" w:semiHidden="1" w:unhideWhenUsed="1"/>
+    <w:lsdException w:name="List Continue" w:semiHidden="1" w:unhideWhenUsed="1"/>
+    <w:lsdException w:name="List Continue 2" w:semiHidden="1" w:unhideWhenUsed="1"/>
+    <w:lsdException w:name="List Continue 3" w:semiHidden="1" w:unhideWhenUsed="1"/>
+    <w:lsdException w:name="List Continue 4" w:semiHidden="1" w:unhideWhenUsed="1"/>
+    <w:lsdException w:name="List Continue 5" w:semiHidden="1" w:unhideWhenUsed="1"/>
+    <w:lsdException w:name="Message Header" w:semiHidden="1" w:unhideWhenUsed="1"/>
+    <w:lsdException w:name="Subtitle" w:uiPriority="11" w:qFormat="1"/>
+    <w:lsdException w:name="Salutation" w:semiHidden="1" w:unhideWhenUsed="1"/>
+    <w:lsdException w:name="Date" w:semiHidden="1" w:unhideWhenUsed="1"/>
+    <w:lsdException w:name="Body Text First Indent" w:semiHidden="1" w:unhideWhenUsed="1"/>
+    <w:lsdException w:name="Body Text First Indent 2" w:semiHidden="1" w:unhideWhenUsed="1"/>
+    <w:lsdException w:name="Note Heading" w:semiHidden="1" w:unhideWhenUsed="1"/>
+    <w:lsdException w:name="Body Text 2" w:semiHidden="1" w:unhideWhenUsed="1"/>
+    <w:lsdException w:name="Body Text 3" w:semiHidden="1" w:unhideWhenUsed="1"/>
+    <w:lsdException w:name="Body Text Indent 2" w:semiHidden="1" w:unhideWhenUsed="1"/>
+    <w:lsdException w:name="Body Text Indent 3" w:semiHidden="1" w:unhideWhenUsed="1"/>
+    <w:lsdException w:name="Block Text" w:semiHidden="1" w:unhideWhenUsed="1"/>
+    <w:lsdException w:name="Hyperlink" w:semiHidden="1" w:unhideWhenUsed="1"/>
+    <w:lsdException w:name="FollowedHyperlink" w:semiHidden="1" w:unhideWhenUsed="1"/>
+    <w:lsdException w:name="Strong" w:uiPriority="22" w:qFormat="1"/>
+    <w:lsdException w:name="Emphasis" w:uiPriority="20" w:qFormat="1"/>
+    <w:lsdException w:name="Document Map" w:semiHidden="1" w:unhideWhenUsed="1"/>
+    <w:lsdException w:name="Plain Text" w:semiHidden="1" w:unhideWhenUsed="1"/>
+    <w:lsdException w:name="E-mail Signature" w:semiHidden="1" w:unhideWhenUsed="1"/>
+    <w:lsdException w:name="HTML Top of Form" w:semiHidden="1" w:unhideWhenUsed="1"/>
+    <w:lsdException w:name="HTML Bottom of Form" w:semiHidden="1" w:unhideWhenUsed="1"/>
+    <w:lsdException w:name="Normal (Web)" w:semiHidden="1" w:unhideWhenUsed="1"/>
+    <w:lsdException w:name="HTML Acronym" w:semiHidden="1" w:unhideWhenUsed="1"/>
+    <w:lsdException w:name="HTML Address" w:semiHidden="1" w:unhideWhenUsed="1"/>
+    <w:lsdException w:name="HTML Cite" w:semiHidden="1" w:unhideWhenUsed="1"/>
+    <w:lsdException w:name="HTML Code" w:semiHidden="1" w:unhideWhenUsed="1"/>
+    <w:lsdException w:name="HTML Definition" w:semiHidden="1" w:unhideWhenUsed="1"/>
+    <w:lsdException w:name="HTML Keyboard" w:semiHidden="1" w:unhideWhenUsed="1"/>
+    <w:lsdException w:name="HTML Preformatted" w:semiHidden="1" w:unhideWhenUsed="1"/>
+    <w:lsdException w:name="HTML Sample" w:semiHidden="1" w:unhideWhenUsed="1"/>
+    <w:lsdException w:name="HTML Typewriter" w:semiHidden="1" w:unhideWhenUsed="1"/>
+    <w:lsdException w:name="HTML Variable" w:semiHidden="1" w:unhideWhenUsed="1"/>
+    <w:lsdException w:name="Normal Table" w:semiHidden="1" w:unhideWhenUsed="1"/>
+    <w:lsdException w:name="annotation subject" w:semiHidden="1" w:unhideWhenUsed="1"/>
+    <w:lsdException w:name="No List" w:semiHidden="1" w:unhideWhenUsed="1"/>
+    <w:lsdException w:name="Outline List 1" w:semiHidden="1" w:unhideWhenUsed="1"/>
+    <w:lsdException w:name="Outline List 2" w:semiHidden="1" w:unhideWhenUsed="1"/>
+    <w:lsdException w:name="Outline List 3" w:semiHidden="1" w:unhideWhenUsed="1"/>
+    <w:lsdException w:name="Table Simple 1" w:semiHidden="1" w:unhideWhenUsed="1"/>
+    <w:lsdException w:name="Table Simple 2" w:semiHidden="1" w:unhideWhenUsed="1"/>
+    <w:lsdException w:name="Table Simple 3" w:semiHidden="1" w:unhideWhenUsed="1"/>
+    <w:lsdException w:name="Table Classic 1" w:semiHidden="1" w:unhideWhenUsed="1"/>
+    <w:lsdException w:name="Table Classic 2" w:semiHidden="1" w:unhideWhenUsed="1"/>
+    <w:lsdException w:name="Table Classic 3" w:semiHidden="1" w:unhideWhenUsed="1"/>
+    <w:lsdException w:name="Table Classic 4" w:semiHidden="1" w:unhideWhenUsed="1"/>
+    <w:lsdException w:name="Table Colorful 1" w:semiHidden="1" w:unhideWhenUsed="1"/>
+    <w:lsdException w:name="Table Colorful 2" w:semiHidden="1" w:unhideWhenUsed="1"/>
+    <w:lsdException w:name="Table Colorful 3" w:semiHidden="1" w:unhideWhenUsed="1"/>
+    <w:lsdException w:name="Table Columns 1" w:semiHidden="1" w:unhideWhenUsed="1"/>
+    <w:lsdException w:name="Table Columns 2" w:semiHidden="1" w:unhideWhenUsed="1"/>
+    <w:lsdException w:name="Table Columns 3" w:semiHidden="1" w:unhideWhenUsed="1"/>
+    <w:lsdException w:name="Table Columns 4" w:semiHidden="1" w:unhideWhenUsed="1"/>
+    <w:lsdException w:name="Table Columns 5" w:semiHidden="1" w:unhideWhenUsed="1"/>
+    <w:lsdException w:name="Table Grid 1" w:semiHidden="1" w:unhideWhenUsed="1"/>
+    <w:lsdException w:name="Table Grid 2" w:semiHidden="1" w:unhideWhenUsed="1"/>
+    <w:lsdException w:name="Table Grid 3" w:semiHidden="1" w:unhideWhenUsed="1"/>
+    <w:lsdException w:name="Table Grid 4" w:semiHidden="1" w:unhideWhenUsed="1"/>
+    <w:lsdException w:name="Table Grid 5" w:semiHidden="1" w:unhideWhenUsed="1"/>
+    <w:lsdException w:name="Table Grid 6" w:semiHidden="1" w:unhideWhenUsed="1"/>
+    <w:lsdException w:name="Table Grid 7" w:semiHidden="1" w:unhideWhenUsed="1"/>
+    <w:lsdException w:name="Table Grid 8" w:semiHidden="1" w:unhideWhenUsed="1"/>
+    <w:lsdException w:name="Table List 1" w:semiHidden="1" w:unhideWhenUsed="1"/>
+    <w:lsdException w:name="Table List 2" w:semiHidden="1" w:unhideWhenUsed="1"/>
+    <w:lsdException w:name="Table List 3" w:semiHidden="1" w:unhideWhenUsed="1"/>
+    <w:lsdException w:name="Table List 4" w:semiHidden="1" w:unhideWhenUsed="1"/>
+    <w:lsdException w:name="Table List 5" w:semiHidden="1" w:unhideWhenUsed="1"/>
+    <w:lsdException w:name="Table List 6" w:semiHidden="1" w:unhideWhenUsed="1"/>
+    <w:lsdException w:name="Table List 7" w:semiHidden="1" w:unhideWhenUsed="1"/>
+    <w:lsdException w:name="Table List 8" w:semiHidden="1" w:unhideWhenUsed="1"/>
+    <w:lsdException w:name="Table 3D effects 1" w:semiHidden="1" w:unhideWhenUsed="1"/>
+    <w:lsdException w:name="Table 3D effects 2" w:semiHidden="1" w:unhideWhenUsed="1"/>
+    <w:lsdException w:name="Table 3D effects 3" w:semiHidden="1" w:unhideWhenUsed="1"/>
+    <w:lsdException w:name="Table Contemporary" w:semiHidden="1" w:unhideWhenUsed="1"/>
+    <w:lsdException w:name="Table Elegant" w:semiHidden="1" w:unhideWhenUsed="1"/>
+    <w:lsdException w:name="Table Professional" w:semiHidden="1" w:unhideWhenUsed="1"/>
+    <w:lsdException w:name="Table Subtle 1" w:semiHidden="1" w:unhideWhenUsed="1"/>
+    <w:lsdException w:name="Table Subtle 2" w:semiHidden="1" w:unhideWhenUsed="1"/>
+    <w:lsdException w:name="Table Web 1" w:semiHidden="1" w:unhideWhenUsed="1"/>
+    <w:lsdException w:name="Table Web 2" w:semiHidden="1" w:unhideWhenUsed="1"/>
+    <w:lsdException w:name="Table Web 3" w:semiHidden="1" w:unhideWhenUsed="1"/>
+    <w:lsdException w:name="Balloon Text" w:semiHidden="1" w:unhideWhenUsed="1"/>
+    <w:lsdException w:name="Table Grid" w:uiPriority="39"/>
+    <w:lsdException w:name="Table Theme" w:semiHidden="1" w:unhideWhenUsed="1"/>
+    <w:lsdException w:name="Placeholder Text" w:semiHidden="1"/>
+    <w:lsdException w:name="No Spacing" w:uiPriority="1" w:qFormat="1"/>
+    <w:lsdException w:name="Light Shading" w:uiPriority="60"/>
+    <w:lsdException w:name="Light List" w:uiPriority="61"/>
+    <w:lsdException w:name="Light Grid" w:uiPriority="62"/>
+    <w:lsdException w:name="Medium Shading 1" w:uiPriority="63"/>
+    <w:lsdException w:name="Medium Shading 2" w:uiPriority="64"/>
+    <w:lsdException w:name="Medium List 1" w:uiPriority="65"/>
+    <w:lsdException w:name="Medium List 2" w:uiPriority="66"/>
+    <w:lsdException w:name="Medium Grid 1" w:uiPriority="67"/>
+    <w:lsdException w:name="Medium Grid 2" w:uiPriority="68"/>
+    <w:lsdException w:name="Medium Grid 3" w:uiPriority="69"/>
+    <w:lsdException w:name="Dark List" w:uiPriority="70"/>
+    <w:lsdException w:name="Colorful Shading" w:uiPriority="71"/>
+    <w:lsdException w:name="Colorful List" w:uiPriority="72"/>
+    <w:lsdException w:name="Colorful Grid" w:uiPriority="73"/>
+    <w:lsdException w:name="Light Shading Accent 1" w:uiPriority="60"/>
+    <w:lsdException w:name="Light List Accent 1" w:uiPriority="61"/>
+    <w:lsdException w:name="Light Grid Accent 1" w:uiPriority="62"/>
+    <w:lsdException w:name="Medium Shading 1 Accent 1" w:uiPriority="63"/>
+    <w:lsdException w:name="Medium Shading 2 Accent 1" w:uiPriority="64"/>
+    <w:lsdException w:name="Medium List 1 Accent 1" w:uiPriority="65"/>
+    <w:lsdException w:name="Revision" w:semiHidden="1"/>
+    <w:lsdException w:name="List Paragraph" w:uiPriority="34" w:qFormat="1"/>
+    <w:lsdException w:name="Quote" w:uiPriority="29" w:qFormat="1"/>
+    <w:lsdException w:name="Intense Quote" w:uiPriority="30" w:qFormat="1"/>
+    <w:lsdException w:name="Medium List 2 Accent 1" w:uiPriority="66"/>
+    <w:lsdException w:name="Medium Grid 1 Accent 1" w:uiPriority="67"/>
+    <w:lsdException w:name="Medium Grid 2 Accent 1" w:uiPriority="68"/>
+    <w:lsdException w:name="Medium Grid 3 Accent 1" w:uiPriority="69"/>
+    <w:lsdException w:name="Dark List Accent 1" w:uiPriority="70"/>
+    <w:lsdException w:name="Colorful Shading Accent 1" w:uiPriority="71"/>
+    <w:lsdException w:name="Colorful List Accent 1" w:uiPriority="72"/>
+    <w:lsdException w:name="Colorful Grid Accent 1" w:uiPriority="73"/>
+    <w:lsdException w:name="Light Shading Accent 2" w:uiPriority="60"/>
+    <w:lsdException w:name="Light List Accent 2" w:uiPriority="61"/>
+    <w:lsdException w:name="Light Grid Accent 2" w:uiPriority="62"/>
+    <w:lsdException w:name="Medium Shading 1 Accent 2" w:uiPriority="63"/>
+    <w:lsdException w:name="Medium Shading 2 Accent 2" w:uiPriority="64"/>
+    <w:lsdException w:name="Medium List 1 Accent 2" w:uiPriority="65"/>
+    <w:lsdException w:name="Medium List 2 Accent 2" w:uiPriority="66"/>
+    <w:lsdException w:name="Medium Grid 1 Accent 2" w:uiPriority="67"/>
+    <w:lsdException w:name="Medium Grid 2 Accent 2" w:uiPriority="68"/>
+    <w:lsdException w:name="Medium Grid 3 Accent 2" w:uiPriority="69"/>
+    <w:lsdException w:name="Dark List Accent 2" w:uiPriority="70"/>
+    <w:lsdException w:name="Colorful Shading Accent 2" w:uiPriority="71"/>
+    <w:lsdException w:name="Colorful List Accent 2" w:uiPriority="72"/>
+    <w:lsdException w:name="Colorful Grid Accent 2" w:uiPriority="73"/>
+    <w:lsdException w:name="Light Shading Accent 3" w:uiPriority="60"/>
+    <w:lsdException w:name="Light List Accent 3" w:uiPriority="61"/>
+    <w:lsdException w:name="Light Grid Accent 3" w:uiPriority="62"/>
+    <w:lsdException w:name="Medium Shading 1 Accent 3" w:uiPriority="63"/>
+    <w:lsdException w:name="Medium Shading 2 Accent 3" w:uiPriority="64"/>
+    <w:lsdException w:name="Medium List 1 Accent 3" w:uiPriority="65"/>
+    <w:lsdException w:name="Medium List 2 Accent 3" w:uiPriority="66"/>
+    <w:lsdException w:name="Medium Grid 1 Accent 3" w:uiPriority="67"/>
+    <w:lsdException w:name="Medium Grid 2 Accent 3" w:uiPriority="68"/>
+    <w:lsdException w:name="Medium Grid 3 Accent 3" w:uiPriority="69"/>
+    <w:lsdException w:name="Dark List Accent 3" w:uiPriority="70"/>
+    <w:lsdException w:name="Colorful Shading Accent 3" w:uiPriority="71"/>
+    <w:lsdException w:name="Colorful List Accent 3" w:uiPriority="72"/>
+    <w:lsdException w:name="Colorful Grid Accent 3" w:uiPriority="73"/>
+    <w:lsdException w:name="Light Shading Accent 4" w:uiPriority="60"/>
+    <w:lsdException w:name="Light List Accent 4" w:uiPriority="61"/>
+    <w:lsdException w:name="Light Grid Accent 4" w:uiPriority="62"/>
+    <w:lsdException w:name="Medium Shading 1 Accent 4" w:uiPriority="63"/>
+    <w:lsdException w:name="Medium Shading 2 Accent 4" w:uiPriority="64"/>
+    <w:lsdException w:name="Medium List 1 Accent 4" w:uiPriority="65"/>
+    <w:lsdException w:name="Medium List 2 Accent 4" w:uiPriority="66"/>
+    <w:lsdException w:name="Medium Grid 1 Accent 4" w:uiPriority="67"/>
+    <w:lsdException w:name="Medium Grid 2 Accent 4" w:uiPriority="68"/>
+    <w:lsdException w:name="Medium Grid 3 Accent 4" w:uiPriority="69"/>
+    <w:lsdException w:name="Dark List Accent 4" w:uiPriority="70"/>
+    <w:lsdException w:name="Colorful Shading Accent 4" w:uiPriority="71"/>
+    <w:lsdException w:name="Colorful List Accent 4" w:uiPriority="72"/>
+    <w:lsdException w:name="Colorful Grid Accent 4" w:uiPriority="73"/>
+    <w:lsdException w:name="Light Shading Accent 5" w:uiPriority="60"/>
+    <w:lsdException w:name="Light List Accent 5" w:uiPriority="61"/>
+    <w:lsdException w:name="Light Grid Accent 5" w:uiPriority="62"/>
+    <w:lsdException w:name="Medium Shading 1 Accent 5" w:uiPriority="63"/>
+    <w:lsdException w:name="Medium Shading 2 Accent 5" w:uiPriority="64"/>
+    <w:lsdException w:name="Medium List 1 Accent 5" w:uiPriority="65"/>
+    <w:lsdException w:name="Medium List 2 Accent 5" w:uiPriority="66"/>
+    <w:lsdException w:name="Medium Grid 1 Accent 5" w:uiPriority="67"/>
+    <w:lsdException w:name="Medium Grid 2 Accent 5" w:uiPriority="68"/>
+    <w:lsdException w:name="Medium Grid 3 Accent 5" w:uiPriority="69"/>
+    <w:lsdException w:name="Dark List Accent 5" w:uiPriority="70"/>
+    <w:lsdException w:name="Colorful Shading Accent 5" w:uiPriority="71"/>
+    <w:lsdException w:name="Colorful List Accent 5" w:uiPriority="72"/>
+    <w:lsdException w:name="Colorful Grid Accent 5" w:uiPriority="73"/>
+    <w:lsdException w:name="Light Shading Accent 6" w:uiPriority="60"/>
+    <w:lsdException w:name="Light List Accent 6" w:uiPriority="61"/>
+    <w:lsdException w:name="Light Grid Accent 6" w:uiPriority="62"/>
+    <w:lsdException w:name="Medium Shading 1 Accent 6" w:uiPriority="63"/>
+    <w:lsdException w:name="Medium Shading 2 Accent 6" w:uiPriority="64"/>
+    <w:lsdException w:name="Medium List 1 Accent 6" w:uiPriority="65"/>
+    <w:lsdException w:name="Medium List 2 Accent 6" w:uiPriority="66"/>
+    <w:lsdException w:name="Medium Grid 1 Accent 6" w:uiPriority="67"/>
+    <w:lsdException w:name="Medium Grid 2 Accent 6" w:uiPriority="68"/>
+    <w:lsdException w:name="Medium Grid 3 Accent 6" w:uiPriority="69"/>
+    <w:lsdException w:name="Dark List Accent 6" w:uiPriority="70"/>
+    <w:lsdException w:name="Colorful Shading Accent 6" w:uiPriority="71"/>
+    <w:lsdException w:name="Colorful List Accent 6" w:uiPriority="72"/>
+    <w:lsdException w:name="Colorful Grid Accent 6" w:uiPriority="73"/>
+    <w:lsdException w:name="Subtle Emphasis" w:uiPriority="19" w:qFormat="1"/>
+    <w:lsdException w:name="Intense Emphasis" w:uiPriority="21" w:qFormat="1"/>
+    <w:lsdException w:name="Subtle Reference" w:uiPriority="31" w:qFormat="1"/>
+    <w:lsdException w:name="Intense Reference" w:uiPriority="32" w:qFormat="1"/>
+    <w:lsdException w:name="Book Title" w:uiPriority="33" w:qFormat="1"/>
+    <w:lsdException w:name="Bibliography" w:semiHidden="1" w:uiPriority="37" w:unhideWhenUsed="1"/>
+    <w:lsdException w:name="TOC Heading" w:semiHidden="1" w:uiPriority="39" w:unhideWhenUsed="1" w:qFormat="1"/>
+    <w:lsdException w:name="Plain Table 1" w:uiPriority="41"/>
+    <w:lsdException w:name="Plain Table 2" w:uiPriority="42"/>
+    <w:lsdException w:name="Plain Table 3" w:uiPriority="43"/>
+    <w:lsdException w:name="Plain Table 4" w:uiPriority="44"/>
+    <w:lsdException w:name="Plain Table 5" w:uiPriority="45"/>
+    <w:lsdException w:name="Grid Table Light" w:uiPriority="40"/>
+    <w:lsdException w:name="Grid Table 1 Light" w:uiPriority="46"/>
+    <w:lsdException w:name="Grid Table 2" w:uiPriority="47"/>
+    <w:lsdException w:name="Grid Table 3" w:uiPriority="48"/>
+    <w:lsdException w:name="Grid Table 4" w:uiPriority="49"/>
+    <w:lsdException w:name="Grid Table 5 Dark" w:uiPriority="50"/>
+    <w:lsdException w:name="Grid Table 6 Colorful" w:uiPriority="51"/>
+    <w:lsdException w:name="Grid Table 7 Colorful" w:uiPriority="52"/>
+    <w:lsdException w:name="Grid Table 1 Light Accent 1" w:uiPriority="46"/>
+    <w:lsdException w:name="Grid Table 2 Accent 1" w:uiPriority="47"/>
+    <w:lsdException w:name="Grid Table 3 Accent 1" w:uiPriority="48"/>
+    <w:lsdException w:name="Grid Table 4 Accent 1" w:uiPriority="49"/>
+    <w:lsdException w:name="Grid Table 5 Dark Accent 1" w:uiPriority="50"/>
+    <w:lsdException w:name="Grid Table 6 Colorful Accent 1" w:uiPriority="51"/>
+    <w:lsdException w:name="Grid Table 7 Colorful Accent 1" w:uiPriority="52"/>
+    <w:lsdException w:name="Grid Table 1 Light Accent 2" w:uiPriority="46"/>
+    <w:lsdException w:name="Grid Table 2 Accent 2" w:uiPriority="47"/>
+    <w:lsdException w:name="Grid Table 3 Accent 2" w:uiPriority="48"/>
+    <w:lsdException w:name="Grid Table 4 Accent 2" w:uiPriority="49"/>
+    <w:lsdException w:name="Grid Table 5 Dark Accent 2" w:uiPriority="50"/>
+    <w:lsdException w:name="Grid Table 6 Colorful Accent 2" w:uiPriority="51"/>
+    <w:lsdException w:name="Grid Table 7 Colorful Accent 2" w:uiPriority="52"/>
+    <w:lsdException w:name="Grid Table 1 Light Accent 3" w:uiPriority="46"/>
+    <w:lsdException w:name="Grid Table 2 Accent 3" w:uiPriority="47"/>
+    <w:lsdException w:name="Grid Table 3 Accent 3" w:uiPriority="48"/>
+    <w:lsdException w:name="Grid Table 4 Accent 3" w:uiPriority="49"/>
+    <w:lsdException w:name="Grid Table 5 Dark Accent 3" w:uiPriority="50"/>
+    <w:lsdException w:name="Grid Table 6 Colorful Accent 3" w:uiPriority="51"/>
+    <w:lsdException w:name="Grid Table 7 Colorful Accent 3" w:uiPriority="52"/>
+    <w:lsdException w:name="Grid Table 1 Light Accent 4" w:uiPriority="46"/>
+    <w:lsdException w:name="Grid Table 2 Accent 4" w:uiPriority="47"/>
+    <w:lsdException w:name="Grid Table 3 Accent 4" w:uiPriority="48"/>
+    <w:lsdException w:name="Grid Table 4 Accent 4" w:uiPriority="49"/>
+    <w:lsdException w:name="Grid Table 5 Dark Accent 4" w:uiPriority="50"/>
+    <w:lsdException w:name="Grid Table 6 Colorful Accent 4" w:uiPriority="51"/>
+    <w:lsdException w:name="Grid Table 7 Colorful Accent 4" w:uiPriority="52"/>
+    <w:lsdException w:name="Grid Table 1 Light Accent 5" w:uiPriority="46"/>
+    <w:lsdException w:name="Grid Table 2 Accent 5" w:uiPriority="47"/>
+    <w:lsdException w:name="Grid Table 3 Accent 5" w:uiPriority="48"/>
+    <w:lsdException w:name="Grid Table 4 Accent 5" w:uiPriority="49"/>
+    <w:lsdException w:name="Grid Table 5 Dark Accent 5" w:uiPriority="50"/>
+    <w:lsdException w:name="Grid Table 6 Colorful Accent 5" w:uiPriority="51"/>
+    <w:lsdException w:name="Grid Table 7 Colorful Accent 5" w:uiPriority="52"/>
+    <w:lsdException w:name="Grid Table 1 Light Accent 6" w:uiPriority="46"/>
+    <w:lsdException w:name="Grid Table 2 Accent 6" w:uiPriority="47"/>
+    <w:lsdException w:name="Grid Table 3 Accent 6" w:uiPriority="48"/>
+    <w:lsdException w:name="Grid Table 4 Accent 6" w:uiPriority="49"/>
+    <w:lsdException w:name="Grid Table 5 Dark Accent 6" w:uiPriority="50"/>
+    <w:lsdException w:name="Grid Table 6 Colorful Accent 6" w:uiPriority="51"/>
+    <w:lsdException w:name="Grid Table 7 Colorful Accent 6" w:uiPriority="52"/>
+    <w:lsdException w:name="List Table 1 Light" w:uiPriority="46"/>
+    <w:lsdException w:name="List Table 2" w:uiPriority="47"/>
+    <w:lsdException w:name="List Table 3" w:uiPriority="48"/>
+    <w:lsdException w:name="List Table 4" w:uiPriority="49"/>
+    <w:lsdException w:name="List Table 5 Dark" w:uiPriority="50"/>
+    <w:lsdException w:name="List Table 6 Colorful" w:uiPriority="51"/>
+    <w:lsdException w:name="List Table 7 Colorful" w:uiPriority="52"/>
+    <w:lsdException w:name="List Table 1 Light Accent 1" w:uiPriority="46"/>
+    <w:lsdException w:name="List Table 2 Accent 1" w:uiPriority="47"/>
+    <w:lsdException w:name="List Table 3 Accent 1" w:uiPriority="48"/>
+    <w:lsdException w:name="List Table 4 Accent 1" w:uiPriority="49"/>
+    <w:lsdException w:name="List Table 5 Dark Accent 1" w:uiPriority="50"/>
+    <w:lsdException w:name="List Table 6 Colorful Accent 1" w:uiPriority="51"/>
+    <w:lsdException w:name="List Table 7 Colorful Accent 1" w:uiPriority="52"/>
+    <w:lsdException w:name="List Table 1 Light Accent 2" w:uiPriority="46"/>
+    <w:lsdException w:name="List Table 2 Accent 2" w:uiPriority="47"/>
+    <w:lsdException w:name="List Table 3 Accent 2" w:uiPriority="48"/>
+    <w:lsdException w:name="List Table 4 Accent 2" w:uiPriority="49"/>
+    <w:lsdException w:name="List Table 5 Dark Accent 2" w:uiPriority="50"/>
+    <w:lsdException w:name="List Table 6 Colorful Accent 2" w:uiPriority="51"/>
+    <w:lsdException w:name="List Table 7 Colorful Accent 2" w:uiPriority="52"/>
+    <w:lsdException w:name="List Table 1 Light Accent 3" w:uiPriority="46"/>
+    <w:lsdException w:name="List Table 2 Accent 3" w:uiPriority="47"/>
+    <w:lsdException w:name="List Table 3 Accent 3" w:uiPriority="48"/>
+    <w:lsdException w:name="List Table 4 Accent 3" w:uiPriority="49"/>
+    <w:lsdException w:name="List Table 5 Dark Accent 3" w:uiPriority="50"/>
+    <w:lsdException w:name="List Table 6 Colorful Accent 3" w:uiPriority="51"/>
+    <w:lsdException w:name="List Table 7 Colorful Accent 3" w:uiPriority="52"/>
+    <w:lsdException w:name="List Table 1 Light Accent 4" w:uiPriority="46"/>
+    <w:lsdException w:name="List Table 2 Accent 4" w:uiPriority="47"/>
+    <w:lsdException w:name="List Table 3 Accent 4" w:uiPriority="48"/>
+    <w:lsdException w:name="List Table 4 Accent 4" w:uiPriority="49"/>
+    <w:lsdException w:name="List Table 5 Dark Accent 4" w:uiPriority="50"/>
+    <w:lsdException w:name="List Table 6 Colorful Accent 4" w:uiPriority="51"/>
+    <w:lsdException w:name="List Table 7 Colorful Accent 4" w:uiPriority="52"/>
+    <w:lsdException w:name="List Table 1 Light Accent 5" w:uiPriority="46"/>
+    <w:lsdException w:name="List Table 2 Accent 5" w:uiPriority="47"/>
+    <w:lsdException w:name="List Table 3 Accent 5" w:uiPriority="48"/>
+    <w:lsdException w:name="List Table 4 Accent 5" w:uiPriority="49"/>
+    <w:lsdException w:name="List Table 5 Dark Accent 5" w:uiPriority="50"/>
+    <w:lsdException w:name="List Table 6 Colorful Accent 5" w:uiPriority="51"/>
+    <w:lsdException w:name="List Table 7 Colorful Accent 5" w:uiPriority="52"/>
+    <w:lsdException w:name="List Table 1 Light Accent 6" w:uiPriority="46"/>
+    <w:lsdException w:name="List Table 2 Accent 6" w:uiPriority="47"/>
+    <w:lsdException w:name="List Table 3 Accent 6" w:uiPriority="48"/>
+    <w:lsdException w:name="List Table 4 Accent 6" w:uiPriority="49"/>
+    <w:lsdException w:name="List Table 5 Dark Accent 6" w:uiPriority="50"/>
+    <w:lsdException w:name="List Table 6 Colorful Accent 6" w:uiPriority="51"/>
+    <w:lsdException w:name="List Table 7 Colorful Accent 6" w:uiPriority="52"/>
+    <w:lsdException w:name="Mention" w:semiHidden="1" w:unhideWhenUsed="1"/>
+    <w:lsdException w:name="Smart Hyperlink" w:semiHidden="1" w:unhideWhenUsed="1"/>
+    <w:lsdException w:name="Hashtag" w:semiHidden="1" w:unhideWhenUsed="1"/>
+    <w:lsdException w:name="Unresolved Mention" w:semiHidden="1" w:unhideWhenUsed="1"/>
+    <w:lsdException w:name="Smart Link" w:semiHidden="1" w:unhideWhenUsed="1"/>
+  </w:latentStyles>
+  <w:style w:type="paragraph" w:default="1" w:styleId="Normal">
+    <w:name w:val="Normal"/>
+    <w:qFormat/>
   </w:style>
   <w:style w:type="paragraph" w:styleId="Heading1">
     <w:name w:val="heading 1"/>
+    <w:uiPriority w:val="9"/>
+    <w:qFormat/>
     <w:pPr>
       <w:spacing w:before="320" w:after="120"/>
+      <w:outlineLvl w:val="0"/>
     </w:pPr>
     <w:rPr>
       <w:b/>
@@ -1000,13 +1397,57 @@
   </w:style>
   <w:style w:type="paragraph" w:styleId="Heading3">
     <w:name w:val="heading 3"/>
+    <w:uiPriority w:val="9"/>
+    <w:unhideWhenUsed/>
+    <w:qFormat/>
     <w:pPr>
       <w:spacing w:before="80" w:after="120"/>
+      <w:outlineLvl w:val="2"/>
     </w:pPr>
     <w:rPr>
       <w:b/>
       <w:color w:val="B03A2E"/>
       <w:sz w:val="24"/>
+    </w:rPr>
+  </w:style>
+  <w:style w:type="character" w:default="1" w:styleId="DefaultParagraphFont">
+    <w:name w:val="Default Paragraph Font"/>
+    <w:uiPriority w:val="1"/>
+    <w:semiHidden/>
+    <w:unhideWhenUsed/>
+  </w:style>
+  <w:style w:type="table" w:default="1" w:styleId="TableNormal">
+    <w:name w:val="Normal Table"/>
+    <w:uiPriority w:val="99"/>
+    <w:semiHidden/>
+    <w:unhideWhenUsed/>
+    <w:tblPr>
+      <w:tblInd w:w="0" w:type="dxa"/>
+      <w:tblCellMar>
+        <w:top w:w="0" w:type="dxa"/>
+        <w:left w:w="108" w:type="dxa"/>
+        <w:bottom w:w="0" w:type="dxa"/>
+        <w:right w:w="108" w:type="dxa"/>
+      </w:tblCellMar>
+    </w:tblPr>
+  </w:style>
+  <w:style w:type="numbering" w:default="1" w:styleId="NoList">
+    <w:name w:val="No List"/>
+    <w:uiPriority w:val="99"/>
+    <w:semiHidden/>
+    <w:unhideWhenUsed/>
+  </w:style>
+  <w:style w:type="paragraph" w:styleId="Title">
+    <w:name w:val="Title"/>
+    <w:uiPriority w:val="10"/>
+    <w:qFormat/>
+    <w:pPr>
+      <w:spacing w:after="120"/>
+    </w:pPr>
+    <w:rPr>
+      <w:b/>
+      <w:color w:val="8A6A1F"/>
+      <w:sz w:val="44"/>
     </w:rPr>
   </w:style>
   <w:style w:type="paragraph" w:styleId="Quote">
@@ -1023,12 +1464,326 @@
   <w:style w:type="paragraph" w:styleId="ListParagraph">
     <w:name w:val="List Paragraph"/>
     <w:pPr>
-      <w:spacing w:before="0" w:after="120"/>
+      <w:spacing w:after="120"/>
     </w:pPr>
     <w:rPr>
       <w:color w:val="000000"/>
-      <w:sz w:val="22"/>
     </w:rPr>
   </w:style>
 </w:styles>
+</file>
+
+<file path=word/theme/theme1.xml><?xml version="1.0" encoding="utf-8"?>
+<a:theme xmlns:a="http://schemas.openxmlformats.org/drawingml/2006/main" name="Office Theme">
+  <a:themeElements>
+    <a:clrScheme name="Office">
+      <a:dk1>
+        <a:sysClr val="windowText" lastClr="000000"/>
+      </a:dk1>
+      <a:lt1>
+        <a:sysClr val="window" lastClr="FFFFFF"/>
+      </a:lt1>
+      <a:dk2>
+        <a:srgbClr val="0E2841"/>
+      </a:dk2>
+      <a:lt2>
+        <a:srgbClr val="E8E8E8"/>
+      </a:lt2>
+      <a:accent1>
+        <a:srgbClr val="156082"/>
+      </a:accent1>
+      <a:accent2>
+        <a:srgbClr val="E97132"/>
+      </a:accent2>
+      <a:accent3>
+        <a:srgbClr val="196B24"/>
+      </a:accent3>
+      <a:accent4>
+        <a:srgbClr val="0F9ED5"/>
+      </a:accent4>
+      <a:accent5>
+        <a:srgbClr val="A02B93"/>
+      </a:accent5>
+      <a:accent6>
+        <a:srgbClr val="4EA72E"/>
+      </a:accent6>
+      <a:hlink>
+        <a:srgbClr val="467886"/>
+      </a:hlink>
+      <a:folHlink>
+        <a:srgbClr val="96607D"/>
+      </a:folHlink>
+    </a:clrScheme>
+    <a:fontScheme name="Office">
+      <a:majorFont>
+        <a:latin typeface="Aptos Display" panose="02110004020202020204"/>
+        <a:ea typeface=""/>
+        <a:cs typeface=""/>
+        <a:font script="Jpan" typeface="游ゴシック Light"/>
+        <a:font script="Hang" typeface="맑은 고딕"/>
+        <a:font script="Hans" typeface="等线 Light"/>
+        <a:font script="Hant" typeface="新細明體"/>
+        <a:font script="Arab" typeface="Times New Roman"/>
+        <a:font script="Hebr" typeface="Times New Roman"/>
+        <a:font script="Thai" typeface="Angsana New"/>
+        <a:font script="Ethi" typeface="Nyala"/>
+        <a:font script="Beng" typeface="Vrinda"/>
+        <a:font script="Gujr" typeface="Shruti"/>
+        <a:font script="Khmr" typeface="MoolBoran"/>
+        <a:font script="Knda" typeface="Tunga"/>
+        <a:font script="Guru" typeface="Raavi"/>
+        <a:font script="Cans" typeface="Euphemia"/>
+        <a:font script="Cher" typeface="Plantagenet Cherokee"/>
+        <a:font script="Yiii" typeface="Microsoft Yi Baiti"/>
+        <a:font script="Tibt" typeface="Microsoft Himalaya"/>
+        <a:font script="Thaa" typeface="MV Boli"/>
+        <a:font script="Deva" typeface="Mangal"/>
+        <a:font script="Telu" typeface="Gautami"/>
+        <a:font script="Taml" typeface="Latha"/>
+        <a:font script="Syrc" typeface="Estrangelo Edessa"/>
+        <a:font script="Orya" typeface="Kalinga"/>
+        <a:font script="Mlym" typeface="Kartika"/>
+        <a:font script="Laoo" typeface="DokChampa"/>
+        <a:font script="Sinh" typeface="Iskoola Pota"/>
+        <a:font script="Mong" typeface="Mongolian Baiti"/>
+        <a:font script="Viet" typeface="Times New Roman"/>
+        <a:font script="Uigh" typeface="Microsoft Uighur"/>
+        <a:font script="Geor" typeface="Sylfaen"/>
+        <a:font script="Armn" typeface="Arial"/>
+        <a:font script="Bugi" typeface="Leelawadee UI"/>
+        <a:font script="Bopo" typeface="Microsoft JhengHei"/>
+        <a:font script="Java" typeface="Javanese Text"/>
+        <a:font script="Lisu" typeface="Segoe UI"/>
+        <a:font script="Mymr" typeface="Myanmar Text"/>
+        <a:font script="Nkoo" typeface="Ebrima"/>
+        <a:font script="Olck" typeface="Nirmala UI"/>
+        <a:font script="Osma" typeface="Ebrima"/>
+        <a:font script="Phag" typeface="Phagspa"/>
+        <a:font script="Syrn" typeface="Estrangelo Edessa"/>
+        <a:font script="Syrj" typeface="Estrangelo Edessa"/>
+        <a:font script="Syre" typeface="Estrangelo Edessa"/>
+        <a:font script="Sora" typeface="Nirmala UI"/>
+        <a:font script="Tale" typeface="Microsoft Tai Le"/>
+        <a:font script="Talu" typeface="Microsoft New Tai Lue"/>
+        <a:font script="Tfng" typeface="Ebrima"/>
+      </a:majorFont>
+      <a:minorFont>
+        <a:latin typeface="Aptos" panose="02110004020202020204"/>
+        <a:ea typeface=""/>
+        <a:cs typeface=""/>
+        <a:font script="Jpan" typeface="游明朝"/>
+        <a:font script="Hang" typeface="맑은 고딕"/>
+        <a:font script="Hans" typeface="等线"/>
+        <a:font script="Hant" typeface="新細明體"/>
+        <a:font script="Arab" typeface="Arial"/>
+        <a:font script="Hebr" typeface="Arial"/>
+        <a:font script="Thai" typeface="Cordia New"/>
+        <a:font script="Ethi" typeface="Nyala"/>
+        <a:font script="Beng" typeface="Vrinda"/>
+        <a:font script="Gujr" typeface="Shruti"/>
+        <a:font script="Khmr" typeface="DaunPenh"/>
+        <a:font script="Knda" typeface="Tunga"/>
+        <a:font script="Guru" typeface="Raavi"/>
+        <a:font script="Cans" typeface="Euphemia"/>
+        <a:font script="Cher" typeface="Plantagenet Cherokee"/>
+        <a:font script="Yiii" typeface="Microsoft Yi Baiti"/>
+        <a:font script="Tibt" typeface="Microsoft Himalaya"/>
+        <a:font script="Thaa" typeface="MV Boli"/>
+        <a:font script="Deva" typeface="Mangal"/>
+        <a:font script="Telu" typeface="Gautami"/>
+        <a:font script="Taml" typeface="Latha"/>
+        <a:font script="Syrc" typeface="Estrangelo Edessa"/>
+        <a:font script="Orya" typeface="Kalinga"/>
+        <a:font script="Mlym" typeface="Kartika"/>
+        <a:font script="Laoo" typeface="DokChampa"/>
+        <a:font script="Sinh" typeface="Iskoola Pota"/>
+        <a:font script="Mong" typeface="Mongolian Baiti"/>
+        <a:font script="Viet" typeface="Arial"/>
+        <a:font script="Uigh" typeface="Microsoft Uighur"/>
+        <a:font script="Geor" typeface="Sylfaen"/>
+        <a:font script="Armn" typeface="Arial"/>
+        <a:font script="Bugi" typeface="Leelawadee UI"/>
+        <a:font script="Bopo" typeface="Microsoft JhengHei"/>
+        <a:font script="Java" typeface="Javanese Text"/>
+        <a:font script="Lisu" typeface="Segoe UI"/>
+        <a:font script="Mymr" typeface="Myanmar Text"/>
+        <a:font script="Nkoo" typeface="Ebrima"/>
+        <a:font script="Olck" typeface="Nirmala UI"/>
+        <a:font script="Osma" typeface="Ebrima"/>
+        <a:font script="Phag" typeface="Phagspa"/>
+        <a:font script="Syrn" typeface="Estrangelo Edessa"/>
+        <a:font script="Syrj" typeface="Estrangelo Edessa"/>
+        <a:font script="Syre" typeface="Estrangelo Edessa"/>
+        <a:font script="Sora" typeface="Nirmala UI"/>
+        <a:font script="Tale" typeface="Microsoft Tai Le"/>
+        <a:font script="Talu" typeface="Microsoft New Tai Lue"/>
+        <a:font script="Tfng" typeface="Ebrima"/>
+      </a:minorFont>
+    </a:fontScheme>
+    <a:fmtScheme name="Office">
+      <a:fillStyleLst>
+        <a:solidFill>
+          <a:schemeClr val="phClr"/>
+        </a:solidFill>
+        <a:gradFill rotWithShape="1">
+          <a:gsLst>
+            <a:gs pos="0">
+              <a:schemeClr val="phClr">
+                <a:lumMod val="110000"/>
+                <a:satMod val="105000"/>
+                <a:tint val="67000"/>
+              </a:schemeClr>
+            </a:gs>
+            <a:gs pos="50000">
+              <a:schemeClr val="phClr">
+                <a:lumMod val="105000"/>
+                <a:satMod val="103000"/>
+                <a:tint val="73000"/>
+              </a:schemeClr>
+            </a:gs>
+            <a:gs pos="100000">
+              <a:schemeClr val="phClr">
+                <a:lumMod val="105000"/>
+                <a:satMod val="109000"/>
+                <a:tint val="81000"/>
+              </a:schemeClr>
+            </a:gs>
+          </a:gsLst>
+          <a:lin ang="5400000" scaled="0"/>
+        </a:gradFill>
+        <a:gradFill rotWithShape="1">
+          <a:gsLst>
+            <a:gs pos="0">
+              <a:schemeClr val="phClr">
+                <a:satMod val="103000"/>
+                <a:lumMod val="102000"/>
+                <a:tint val="94000"/>
+              </a:schemeClr>
+            </a:gs>
+            <a:gs pos="50000">
+              <a:schemeClr val="phClr">
+                <a:satMod val="110000"/>
+                <a:lumMod val="100000"/>
+                <a:shade val="100000"/>
+              </a:schemeClr>
+            </a:gs>
+            <a:gs pos="100000">
+              <a:schemeClr val="phClr">
+                <a:lumMod val="99000"/>
+                <a:satMod val="120000"/>
+                <a:shade val="78000"/>
+              </a:schemeClr>
+            </a:gs>
+          </a:gsLst>
+          <a:lin ang="5400000" scaled="0"/>
+        </a:gradFill>
+      </a:fillStyleLst>
+      <a:lnStyleLst>
+        <a:ln w="12700" cap="flat" cmpd="sng" algn="ctr">
+          <a:solidFill>
+            <a:schemeClr val="phClr"/>
+          </a:solidFill>
+          <a:prstDash val="solid"/>
+          <a:miter lim="800000"/>
+        </a:ln>
+        <a:ln w="19050" cap="flat" cmpd="sng" algn="ctr">
+          <a:solidFill>
+            <a:schemeClr val="phClr"/>
+          </a:solidFill>
+          <a:prstDash val="solid"/>
+          <a:miter lim="800000"/>
+        </a:ln>
+        <a:ln w="25400" cap="flat" cmpd="sng" algn="ctr">
+          <a:solidFill>
+            <a:schemeClr val="phClr"/>
+          </a:solidFill>
+          <a:prstDash val="solid"/>
+          <a:miter lim="800000"/>
+        </a:ln>
+      </a:lnStyleLst>
+      <a:effectStyleLst>
+        <a:effectStyle>
+          <a:effectLst/>
+        </a:effectStyle>
+        <a:effectStyle>
+          <a:effectLst/>
+        </a:effectStyle>
+        <a:effectStyle>
+          <a:effectLst>
+            <a:outerShdw blurRad="57150" dist="19050" dir="5400000" algn="ctr" rotWithShape="0">
+              <a:srgbClr val="000000">
+                <a:alpha val="63000"/>
+              </a:srgbClr>
+            </a:outerShdw>
+          </a:effectLst>
+        </a:effectStyle>
+      </a:effectStyleLst>
+      <a:bgFillStyleLst>
+        <a:solidFill>
+          <a:schemeClr val="phClr"/>
+        </a:solidFill>
+        <a:solidFill>
+          <a:schemeClr val="phClr">
+            <a:tint val="95000"/>
+            <a:satMod val="170000"/>
+          </a:schemeClr>
+        </a:solidFill>
+        <a:gradFill rotWithShape="1">
+          <a:gsLst>
+            <a:gs pos="0">
+              <a:schemeClr val="phClr">
+                <a:tint val="93000"/>
+                <a:satMod val="150000"/>
+                <a:shade val="98000"/>
+                <a:lumMod val="102000"/>
+              </a:schemeClr>
+            </a:gs>
+            <a:gs pos="50000">
+              <a:schemeClr val="phClr">
+                <a:tint val="98000"/>
+                <a:satMod val="130000"/>
+                <a:shade val="90000"/>
+                <a:lumMod val="103000"/>
+              </a:schemeClr>
+            </a:gs>
+            <a:gs pos="100000">
+              <a:schemeClr val="phClr">
+                <a:shade val="63000"/>
+                <a:satMod val="120000"/>
+              </a:schemeClr>
+            </a:gs>
+          </a:gsLst>
+          <a:lin ang="5400000" scaled="0"/>
+        </a:gradFill>
+      </a:bgFillStyleLst>
+    </a:fmtScheme>
+  </a:themeElements>
+  <a:objectDefaults>
+    <a:lnDef>
+      <a:spPr/>
+      <a:bodyPr/>
+      <a:lstStyle/>
+      <a:style>
+        <a:lnRef idx="2">
+          <a:schemeClr val="accent1"/>
+        </a:lnRef>
+        <a:fillRef idx="0">
+          <a:schemeClr val="accent1"/>
+        </a:fillRef>
+        <a:effectRef idx="1">
+          <a:schemeClr val="accent1"/>
+        </a:effectRef>
+        <a:fontRef idx="minor">
+          <a:schemeClr val="tx1"/>
+        </a:fontRef>
+      </a:style>
+    </a:lnDef>
+  </a:objectDefaults>
+  <a:extraClrSchemeLst/>
+  <a:extLst>
+    <a:ext uri="{05A4C25C-085E-4340-85A3-A5531E510DB2}">
+      <thm15:themeFamily xmlns:thm15="http://schemas.microsoft.com/office/thememl/2012/main" name="Office Theme" id="{2E142A2C-CD16-42D6-873A-C26D2A0506FA}" vid="{1BDDFF52-6CD6-40A5-AB3C-68EB2F1E4D0A}"/>
+    </a:ext>
+  </a:extLst>
+</a:theme>
 </file>
</xml_diff>